<commit_message>
eerste deel documentatie af
</commit_message>
<xml_diff>
--- a/Documenten/IP2_Team13_Report.docx
+++ b/Documenten/IP2_Team13_Report.docx
@@ -177,8 +177,13 @@
               <w:framePr w:wrap="auto" w:hAnchor="text" w:xAlign="left" w:yAlign="inline"/>
               <w:suppressOverlap w:val="0"/>
             </w:pPr>
-            <w:r>
-              <w:t xml:space="preserve">Boutaarourte Aya </w:t>
+            <w:proofErr w:type="spellStart"/>
+            <w:r>
+              <w:t>Boutaarourte</w:t>
+            </w:r>
+            <w:proofErr w:type="spellEnd"/>
+            <w:r>
+              <w:t xml:space="preserve"> Aya </w:t>
             </w:r>
           </w:p>
           <w:p>
@@ -187,8 +192,21 @@
               <w:framePr w:wrap="auto" w:hAnchor="text" w:xAlign="left" w:yAlign="inline"/>
               <w:suppressOverlap w:val="0"/>
             </w:pPr>
-            <w:r>
-              <w:t xml:space="preserve">Maalmi Yamine </w:t>
+            <w:proofErr w:type="spellStart"/>
+            <w:r>
+              <w:t>Maalmi</w:t>
+            </w:r>
+            <w:proofErr w:type="spellEnd"/>
+            <w:r>
+              <w:t xml:space="preserve"> </w:t>
+            </w:r>
+            <w:proofErr w:type="spellStart"/>
+            <w:r>
+              <w:t>Yamine</w:t>
+            </w:r>
+            <w:proofErr w:type="spellEnd"/>
+            <w:r>
+              <w:t xml:space="preserve"> </w:t>
             </w:r>
           </w:p>
           <w:p>
@@ -207,9 +225,19 @@
               <w:framePr w:wrap="auto" w:hAnchor="text" w:xAlign="left" w:yAlign="inline"/>
               <w:suppressOverlap w:val="0"/>
             </w:pPr>
-            <w:r>
-              <w:t>Vanschoenbeek Yelle</w:t>
-            </w:r>
+            <w:proofErr w:type="spellStart"/>
+            <w:r>
+              <w:t>Vanschoenbeek</w:t>
+            </w:r>
+            <w:proofErr w:type="spellEnd"/>
+            <w:r>
+              <w:t xml:space="preserve"> </w:t>
+            </w:r>
+            <w:proofErr w:type="spellStart"/>
+            <w:r>
+              <w:t>Yelle</w:t>
+            </w:r>
+            <w:proofErr w:type="spellEnd"/>
           </w:p>
           <w:p>
             <w:pPr>
@@ -577,11 +605,19 @@
                   <w:framePr w:wrap="auto" w:hAnchor="text" w:xAlign="left" w:yAlign="inline"/>
                   <w:suppressOverlap w:val="0"/>
                 </w:pPr>
+                <w:proofErr w:type="spellStart"/>
                 <w:r>
                   <w:rPr>
                     <w:rStyle w:val="Titel1"/>
                   </w:rPr>
-                  <w:t>PingFin – Banking Project</w:t>
+                  <w:t>PingFin</w:t>
+                </w:r>
+                <w:proofErr w:type="spellEnd"/>
+                <w:r>
+                  <w:rPr>
+                    <w:rStyle w:val="Titel1"/>
+                  </w:rPr>
+                  <w:t xml:space="preserve"> – Banking Project</w:t>
                 </w:r>
               </w:p>
             </w:tc>
@@ -678,12 +714,14 @@
           <w:pPr>
             <w:pStyle w:val="Kopvaninhoudsopgave"/>
           </w:pPr>
+          <w:proofErr w:type="spellStart"/>
           <w:r>
             <w:rPr>
               <w:lang w:val="fr-FR"/>
             </w:rPr>
             <w:t>Inhoudstafel</w:t>
           </w:r>
+          <w:proofErr w:type="spellEnd"/>
         </w:p>
         <w:p>
           <w:pPr>
@@ -692,7 +730,11 @@
               <w:tab w:val="right" w:leader="dot" w:pos="9062"/>
             </w:tabs>
             <w:rPr>
+              <w:rFonts w:eastAsiaTheme="minorEastAsia" w:cstheme="minorBidi"/>
               <w:noProof/>
+              <w:kern w:val="2"/>
+              <w:lang/>
+              <w14:ligatures w14:val="standardContextual"/>
             </w:rPr>
           </w:pPr>
           <w:r>
@@ -704,14 +746,13 @@
           <w:r>
             <w:fldChar w:fldCharType="separate"/>
           </w:r>
-          <w:hyperlink w:anchor="_Toc228183732" w:history="1">
+          <w:hyperlink w:anchor="_Toc228197955" w:history="1">
             <w:r>
               <w:rPr>
                 <w:rStyle w:val="Hyperlink"/>
                 <w:noProof/>
-                <w:lang w:val="fr-FR"/>
-              </w:rPr>
-              <w:t>Metadata</w:t>
+              </w:rPr>
+              <w:t>1. Inleiding</w:t>
             </w:r>
             <w:r>
               <w:rPr>
@@ -732,7 +773,7 @@
                 <w:noProof/>
                 <w:webHidden/>
               </w:rPr>
-              <w:instrText xml:space="preserve"> PAGEREF _Toc228183732 \h </w:instrText>
+              <w:instrText xml:space="preserve"> PAGEREF _Toc228197955 \h </w:instrText>
             </w:r>
             <w:r>
               <w:rPr>
@@ -753,6 +794,1589 @@
                 <w:webHidden/>
               </w:rPr>
               <w:t>4</w:t>
+            </w:r>
+            <w:r>
+              <w:rPr>
+                <w:noProof/>
+                <w:webHidden/>
+              </w:rPr>
+              <w:fldChar w:fldCharType="end"/>
+            </w:r>
+          </w:hyperlink>
+        </w:p>
+        <w:p>
+          <w:pPr>
+            <w:pStyle w:val="Inhopg2"/>
+            <w:tabs>
+              <w:tab w:val="right" w:leader="dot" w:pos="9062"/>
+            </w:tabs>
+            <w:rPr>
+              <w:rFonts w:eastAsiaTheme="minorEastAsia" w:cstheme="minorBidi"/>
+              <w:noProof/>
+              <w:kern w:val="2"/>
+              <w:lang/>
+              <w14:ligatures w14:val="standardContextual"/>
+            </w:rPr>
+          </w:pPr>
+          <w:hyperlink w:anchor="_Toc228197956" w:history="1">
+            <w:r>
+              <w:rPr>
+                <w:rStyle w:val="Hyperlink"/>
+                <w:noProof/>
+                <w:lang w:val="fr-BE"/>
+              </w:rPr>
+              <w:t xml:space="preserve">1.1 </w:t>
+            </w:r>
+            <w:r>
+              <w:rPr>
+                <w:rStyle w:val="Hyperlink"/>
+                <w:noProof/>
+                <w:lang/>
+              </w:rPr>
+              <w:t>Beschrijving van het project</w:t>
+            </w:r>
+            <w:r>
+              <w:rPr>
+                <w:noProof/>
+                <w:webHidden/>
+              </w:rPr>
+              <w:tab/>
+            </w:r>
+            <w:r>
+              <w:rPr>
+                <w:noProof/>
+                <w:webHidden/>
+              </w:rPr>
+              <w:fldChar w:fldCharType="begin"/>
+            </w:r>
+            <w:r>
+              <w:rPr>
+                <w:noProof/>
+                <w:webHidden/>
+              </w:rPr>
+              <w:instrText xml:space="preserve"> PAGEREF _Toc228197956 \h </w:instrText>
+            </w:r>
+            <w:r>
+              <w:rPr>
+                <w:noProof/>
+                <w:webHidden/>
+              </w:rPr>
+            </w:r>
+            <w:r>
+              <w:rPr>
+                <w:noProof/>
+                <w:webHidden/>
+              </w:rPr>
+              <w:fldChar w:fldCharType="separate"/>
+            </w:r>
+            <w:r>
+              <w:rPr>
+                <w:noProof/>
+                <w:webHidden/>
+              </w:rPr>
+              <w:t>4</w:t>
+            </w:r>
+            <w:r>
+              <w:rPr>
+                <w:noProof/>
+                <w:webHidden/>
+              </w:rPr>
+              <w:fldChar w:fldCharType="end"/>
+            </w:r>
+          </w:hyperlink>
+        </w:p>
+        <w:p>
+          <w:pPr>
+            <w:pStyle w:val="Inhopg2"/>
+            <w:tabs>
+              <w:tab w:val="right" w:leader="dot" w:pos="9062"/>
+            </w:tabs>
+            <w:rPr>
+              <w:rFonts w:eastAsiaTheme="minorEastAsia" w:cstheme="minorBidi"/>
+              <w:noProof/>
+              <w:kern w:val="2"/>
+              <w:lang/>
+              <w14:ligatures w14:val="standardContextual"/>
+            </w:rPr>
+          </w:pPr>
+          <w:hyperlink w:anchor="_Toc228197957" w:history="1">
+            <w:r>
+              <w:rPr>
+                <w:rStyle w:val="Hyperlink"/>
+                <w:noProof/>
+              </w:rPr>
+              <w:t>1.2 Doel van het project</w:t>
+            </w:r>
+            <w:r>
+              <w:rPr>
+                <w:noProof/>
+                <w:webHidden/>
+              </w:rPr>
+              <w:tab/>
+            </w:r>
+            <w:r>
+              <w:rPr>
+                <w:noProof/>
+                <w:webHidden/>
+              </w:rPr>
+              <w:fldChar w:fldCharType="begin"/>
+            </w:r>
+            <w:r>
+              <w:rPr>
+                <w:noProof/>
+                <w:webHidden/>
+              </w:rPr>
+              <w:instrText xml:space="preserve"> PAGEREF _Toc228197957 \h </w:instrText>
+            </w:r>
+            <w:r>
+              <w:rPr>
+                <w:noProof/>
+                <w:webHidden/>
+              </w:rPr>
+            </w:r>
+            <w:r>
+              <w:rPr>
+                <w:noProof/>
+                <w:webHidden/>
+              </w:rPr>
+              <w:fldChar w:fldCharType="separate"/>
+            </w:r>
+            <w:r>
+              <w:rPr>
+                <w:noProof/>
+                <w:webHidden/>
+              </w:rPr>
+              <w:t>4</w:t>
+            </w:r>
+            <w:r>
+              <w:rPr>
+                <w:noProof/>
+                <w:webHidden/>
+              </w:rPr>
+              <w:fldChar w:fldCharType="end"/>
+            </w:r>
+          </w:hyperlink>
+        </w:p>
+        <w:p>
+          <w:pPr>
+            <w:pStyle w:val="Inhopg1"/>
+            <w:tabs>
+              <w:tab w:val="right" w:leader="dot" w:pos="9062"/>
+            </w:tabs>
+            <w:rPr>
+              <w:rFonts w:eastAsiaTheme="minorEastAsia" w:cstheme="minorBidi"/>
+              <w:noProof/>
+              <w:kern w:val="2"/>
+              <w:lang/>
+              <w14:ligatures w14:val="standardContextual"/>
+            </w:rPr>
+          </w:pPr>
+          <w:hyperlink w:anchor="_Toc228197958" w:history="1">
+            <w:r>
+              <w:rPr>
+                <w:rStyle w:val="Hyperlink"/>
+                <w:b/>
+                <w:bCs/>
+                <w:noProof/>
+              </w:rPr>
+              <w:t>2. Schema van de opbouw van het project</w:t>
+            </w:r>
+            <w:r>
+              <w:rPr>
+                <w:noProof/>
+                <w:webHidden/>
+              </w:rPr>
+              <w:tab/>
+            </w:r>
+            <w:r>
+              <w:rPr>
+                <w:noProof/>
+                <w:webHidden/>
+              </w:rPr>
+              <w:fldChar w:fldCharType="begin"/>
+            </w:r>
+            <w:r>
+              <w:rPr>
+                <w:noProof/>
+                <w:webHidden/>
+              </w:rPr>
+              <w:instrText xml:space="preserve"> PAGEREF _Toc228197958 \h </w:instrText>
+            </w:r>
+            <w:r>
+              <w:rPr>
+                <w:noProof/>
+                <w:webHidden/>
+              </w:rPr>
+            </w:r>
+            <w:r>
+              <w:rPr>
+                <w:noProof/>
+                <w:webHidden/>
+              </w:rPr>
+              <w:fldChar w:fldCharType="separate"/>
+            </w:r>
+            <w:r>
+              <w:rPr>
+                <w:noProof/>
+                <w:webHidden/>
+              </w:rPr>
+              <w:t>5</w:t>
+            </w:r>
+            <w:r>
+              <w:rPr>
+                <w:noProof/>
+                <w:webHidden/>
+              </w:rPr>
+              <w:fldChar w:fldCharType="end"/>
+            </w:r>
+          </w:hyperlink>
+        </w:p>
+        <w:p>
+          <w:pPr>
+            <w:pStyle w:val="Inhopg2"/>
+            <w:tabs>
+              <w:tab w:val="right" w:leader="dot" w:pos="9062"/>
+            </w:tabs>
+            <w:rPr>
+              <w:rFonts w:eastAsiaTheme="minorEastAsia" w:cstheme="minorBidi"/>
+              <w:noProof/>
+              <w:kern w:val="2"/>
+              <w:lang/>
+              <w14:ligatures w14:val="standardContextual"/>
+            </w:rPr>
+          </w:pPr>
+          <w:hyperlink w:anchor="_Toc228197959" w:history="1">
+            <w:r>
+              <w:rPr>
+                <w:rStyle w:val="Hyperlink"/>
+                <w:noProof/>
+              </w:rPr>
+              <w:t xml:space="preserve">2.1 </w:t>
+            </w:r>
+            <w:r>
+              <w:rPr>
+                <w:rStyle w:val="Hyperlink"/>
+                <w:noProof/>
+                <w:lang/>
+              </w:rPr>
+              <w:t>Communicatie tussen GUI en API</w:t>
+            </w:r>
+            <w:r>
+              <w:rPr>
+                <w:noProof/>
+                <w:webHidden/>
+              </w:rPr>
+              <w:tab/>
+            </w:r>
+            <w:r>
+              <w:rPr>
+                <w:noProof/>
+                <w:webHidden/>
+              </w:rPr>
+              <w:fldChar w:fldCharType="begin"/>
+            </w:r>
+            <w:r>
+              <w:rPr>
+                <w:noProof/>
+                <w:webHidden/>
+              </w:rPr>
+              <w:instrText xml:space="preserve"> PAGEREF _Toc228197959 \h </w:instrText>
+            </w:r>
+            <w:r>
+              <w:rPr>
+                <w:noProof/>
+                <w:webHidden/>
+              </w:rPr>
+            </w:r>
+            <w:r>
+              <w:rPr>
+                <w:noProof/>
+                <w:webHidden/>
+              </w:rPr>
+              <w:fldChar w:fldCharType="separate"/>
+            </w:r>
+            <w:r>
+              <w:rPr>
+                <w:noProof/>
+                <w:webHidden/>
+              </w:rPr>
+              <w:t>5</w:t>
+            </w:r>
+            <w:r>
+              <w:rPr>
+                <w:noProof/>
+                <w:webHidden/>
+              </w:rPr>
+              <w:fldChar w:fldCharType="end"/>
+            </w:r>
+          </w:hyperlink>
+        </w:p>
+        <w:p>
+          <w:pPr>
+            <w:pStyle w:val="Inhopg2"/>
+            <w:tabs>
+              <w:tab w:val="right" w:leader="dot" w:pos="9062"/>
+            </w:tabs>
+            <w:rPr>
+              <w:rFonts w:eastAsiaTheme="minorEastAsia" w:cstheme="minorBidi"/>
+              <w:noProof/>
+              <w:kern w:val="2"/>
+              <w:lang/>
+              <w14:ligatures w14:val="standardContextual"/>
+            </w:rPr>
+          </w:pPr>
+          <w:hyperlink w:anchor="_Toc228197960" w:history="1">
+            <w:r>
+              <w:rPr>
+                <w:rStyle w:val="Hyperlink"/>
+                <w:noProof/>
+              </w:rPr>
+              <w:t xml:space="preserve">2.2 </w:t>
+            </w:r>
+            <w:r>
+              <w:rPr>
+                <w:rStyle w:val="Hyperlink"/>
+                <w:noProof/>
+                <w:lang/>
+              </w:rPr>
+              <w:t>Databankstructuur</w:t>
+            </w:r>
+            <w:r>
+              <w:rPr>
+                <w:noProof/>
+                <w:webHidden/>
+              </w:rPr>
+              <w:tab/>
+            </w:r>
+            <w:r>
+              <w:rPr>
+                <w:noProof/>
+                <w:webHidden/>
+              </w:rPr>
+              <w:fldChar w:fldCharType="begin"/>
+            </w:r>
+            <w:r>
+              <w:rPr>
+                <w:noProof/>
+                <w:webHidden/>
+              </w:rPr>
+              <w:instrText xml:space="preserve"> PAGEREF _Toc228197960 \h </w:instrText>
+            </w:r>
+            <w:r>
+              <w:rPr>
+                <w:noProof/>
+                <w:webHidden/>
+              </w:rPr>
+            </w:r>
+            <w:r>
+              <w:rPr>
+                <w:noProof/>
+                <w:webHidden/>
+              </w:rPr>
+              <w:fldChar w:fldCharType="separate"/>
+            </w:r>
+            <w:r>
+              <w:rPr>
+                <w:noProof/>
+                <w:webHidden/>
+              </w:rPr>
+              <w:t>5</w:t>
+            </w:r>
+            <w:r>
+              <w:rPr>
+                <w:noProof/>
+                <w:webHidden/>
+              </w:rPr>
+              <w:fldChar w:fldCharType="end"/>
+            </w:r>
+          </w:hyperlink>
+        </w:p>
+        <w:p>
+          <w:pPr>
+            <w:pStyle w:val="Inhopg1"/>
+            <w:tabs>
+              <w:tab w:val="right" w:leader="dot" w:pos="9062"/>
+            </w:tabs>
+            <w:rPr>
+              <w:rFonts w:eastAsiaTheme="minorEastAsia" w:cstheme="minorBidi"/>
+              <w:noProof/>
+              <w:kern w:val="2"/>
+              <w:lang/>
+              <w14:ligatures w14:val="standardContextual"/>
+            </w:rPr>
+          </w:pPr>
+          <w:hyperlink w:anchor="_Toc228197961" w:history="1">
+            <w:r>
+              <w:rPr>
+                <w:rStyle w:val="Hyperlink"/>
+                <w:noProof/>
+              </w:rPr>
+              <w:t>3. Documentatie van de API</w:t>
+            </w:r>
+            <w:r>
+              <w:rPr>
+                <w:noProof/>
+                <w:webHidden/>
+              </w:rPr>
+              <w:tab/>
+            </w:r>
+            <w:r>
+              <w:rPr>
+                <w:noProof/>
+                <w:webHidden/>
+              </w:rPr>
+              <w:fldChar w:fldCharType="begin"/>
+            </w:r>
+            <w:r>
+              <w:rPr>
+                <w:noProof/>
+                <w:webHidden/>
+              </w:rPr>
+              <w:instrText xml:space="preserve"> PAGEREF _Toc228197961 \h </w:instrText>
+            </w:r>
+            <w:r>
+              <w:rPr>
+                <w:noProof/>
+                <w:webHidden/>
+              </w:rPr>
+            </w:r>
+            <w:r>
+              <w:rPr>
+                <w:noProof/>
+                <w:webHidden/>
+              </w:rPr>
+              <w:fldChar w:fldCharType="separate"/>
+            </w:r>
+            <w:r>
+              <w:rPr>
+                <w:noProof/>
+                <w:webHidden/>
+              </w:rPr>
+              <w:t>5</w:t>
+            </w:r>
+            <w:r>
+              <w:rPr>
+                <w:noProof/>
+                <w:webHidden/>
+              </w:rPr>
+              <w:fldChar w:fldCharType="end"/>
+            </w:r>
+          </w:hyperlink>
+        </w:p>
+        <w:p>
+          <w:pPr>
+            <w:pStyle w:val="Inhopg2"/>
+            <w:tabs>
+              <w:tab w:val="right" w:leader="dot" w:pos="9062"/>
+            </w:tabs>
+            <w:rPr>
+              <w:rFonts w:eastAsiaTheme="minorEastAsia" w:cstheme="minorBidi"/>
+              <w:noProof/>
+              <w:kern w:val="2"/>
+              <w:lang/>
+              <w14:ligatures w14:val="standardContextual"/>
+            </w:rPr>
+          </w:pPr>
+          <w:hyperlink w:anchor="_Toc228197962" w:history="1">
+            <w:r>
+              <w:rPr>
+                <w:rStyle w:val="Hyperlink"/>
+                <w:noProof/>
+              </w:rPr>
+              <w:t xml:space="preserve">3.1 </w:t>
+            </w:r>
+            <w:r>
+              <w:rPr>
+                <w:rStyle w:val="Hyperlink"/>
+                <w:noProof/>
+                <w:lang/>
+              </w:rPr>
+              <w:t>Beschrijving van API endpoints</w:t>
+            </w:r>
+            <w:r>
+              <w:rPr>
+                <w:noProof/>
+                <w:webHidden/>
+              </w:rPr>
+              <w:tab/>
+            </w:r>
+            <w:r>
+              <w:rPr>
+                <w:noProof/>
+                <w:webHidden/>
+              </w:rPr>
+              <w:fldChar w:fldCharType="begin"/>
+            </w:r>
+            <w:r>
+              <w:rPr>
+                <w:noProof/>
+                <w:webHidden/>
+              </w:rPr>
+              <w:instrText xml:space="preserve"> PAGEREF _Toc228197962 \h </w:instrText>
+            </w:r>
+            <w:r>
+              <w:rPr>
+                <w:noProof/>
+                <w:webHidden/>
+              </w:rPr>
+            </w:r>
+            <w:r>
+              <w:rPr>
+                <w:noProof/>
+                <w:webHidden/>
+              </w:rPr>
+              <w:fldChar w:fldCharType="separate"/>
+            </w:r>
+            <w:r>
+              <w:rPr>
+                <w:noProof/>
+                <w:webHidden/>
+              </w:rPr>
+              <w:t>5</w:t>
+            </w:r>
+            <w:r>
+              <w:rPr>
+                <w:noProof/>
+                <w:webHidden/>
+              </w:rPr>
+              <w:fldChar w:fldCharType="end"/>
+            </w:r>
+          </w:hyperlink>
+        </w:p>
+        <w:p>
+          <w:pPr>
+            <w:pStyle w:val="Inhopg2"/>
+            <w:tabs>
+              <w:tab w:val="right" w:leader="dot" w:pos="9062"/>
+            </w:tabs>
+            <w:rPr>
+              <w:rFonts w:eastAsiaTheme="minorEastAsia" w:cstheme="minorBidi"/>
+              <w:noProof/>
+              <w:kern w:val="2"/>
+              <w:lang/>
+              <w14:ligatures w14:val="standardContextual"/>
+            </w:rPr>
+          </w:pPr>
+          <w:hyperlink w:anchor="_Toc228197963" w:history="1">
+            <w:r>
+              <w:rPr>
+                <w:rStyle w:val="Hyperlink"/>
+                <w:noProof/>
+              </w:rPr>
+              <w:t xml:space="preserve">3.2 </w:t>
+            </w:r>
+            <w:r>
+              <w:rPr>
+                <w:rStyle w:val="Hyperlink"/>
+                <w:noProof/>
+                <w:lang/>
+              </w:rPr>
+              <w:t>Informatie over gebruikte methoden en parameters</w:t>
+            </w:r>
+            <w:r>
+              <w:rPr>
+                <w:noProof/>
+                <w:webHidden/>
+              </w:rPr>
+              <w:tab/>
+            </w:r>
+            <w:r>
+              <w:rPr>
+                <w:noProof/>
+                <w:webHidden/>
+              </w:rPr>
+              <w:fldChar w:fldCharType="begin"/>
+            </w:r>
+            <w:r>
+              <w:rPr>
+                <w:noProof/>
+                <w:webHidden/>
+              </w:rPr>
+              <w:instrText xml:space="preserve"> PAGEREF _Toc228197963 \h </w:instrText>
+            </w:r>
+            <w:r>
+              <w:rPr>
+                <w:noProof/>
+                <w:webHidden/>
+              </w:rPr>
+            </w:r>
+            <w:r>
+              <w:rPr>
+                <w:noProof/>
+                <w:webHidden/>
+              </w:rPr>
+              <w:fldChar w:fldCharType="separate"/>
+            </w:r>
+            <w:r>
+              <w:rPr>
+                <w:noProof/>
+                <w:webHidden/>
+              </w:rPr>
+              <w:t>5</w:t>
+            </w:r>
+            <w:r>
+              <w:rPr>
+                <w:noProof/>
+                <w:webHidden/>
+              </w:rPr>
+              <w:fldChar w:fldCharType="end"/>
+            </w:r>
+          </w:hyperlink>
+        </w:p>
+        <w:p>
+          <w:pPr>
+            <w:pStyle w:val="Inhopg2"/>
+            <w:tabs>
+              <w:tab w:val="right" w:leader="dot" w:pos="9062"/>
+            </w:tabs>
+            <w:rPr>
+              <w:rFonts w:eastAsiaTheme="minorEastAsia" w:cstheme="minorBidi"/>
+              <w:noProof/>
+              <w:kern w:val="2"/>
+              <w:lang/>
+              <w14:ligatures w14:val="standardContextual"/>
+            </w:rPr>
+          </w:pPr>
+          <w:hyperlink w:anchor="_Toc228197964" w:history="1">
+            <w:r>
+              <w:rPr>
+                <w:rStyle w:val="Hyperlink"/>
+                <w:noProof/>
+              </w:rPr>
+              <w:t xml:space="preserve">3.3 </w:t>
+            </w:r>
+            <w:r>
+              <w:rPr>
+                <w:rStyle w:val="Hyperlink"/>
+                <w:noProof/>
+                <w:lang/>
+              </w:rPr>
+              <w:t>Voorbeeldgebruik met Postman of vergelijkbare tool</w:t>
+            </w:r>
+            <w:r>
+              <w:rPr>
+                <w:noProof/>
+                <w:webHidden/>
+              </w:rPr>
+              <w:tab/>
+            </w:r>
+            <w:r>
+              <w:rPr>
+                <w:noProof/>
+                <w:webHidden/>
+              </w:rPr>
+              <w:fldChar w:fldCharType="begin"/>
+            </w:r>
+            <w:r>
+              <w:rPr>
+                <w:noProof/>
+                <w:webHidden/>
+              </w:rPr>
+              <w:instrText xml:space="preserve"> PAGEREF _Toc228197964 \h </w:instrText>
+            </w:r>
+            <w:r>
+              <w:rPr>
+                <w:noProof/>
+                <w:webHidden/>
+              </w:rPr>
+            </w:r>
+            <w:r>
+              <w:rPr>
+                <w:noProof/>
+                <w:webHidden/>
+              </w:rPr>
+              <w:fldChar w:fldCharType="separate"/>
+            </w:r>
+            <w:r>
+              <w:rPr>
+                <w:noProof/>
+                <w:webHidden/>
+              </w:rPr>
+              <w:t>5</w:t>
+            </w:r>
+            <w:r>
+              <w:rPr>
+                <w:noProof/>
+                <w:webHidden/>
+              </w:rPr>
+              <w:fldChar w:fldCharType="end"/>
+            </w:r>
+          </w:hyperlink>
+        </w:p>
+        <w:p>
+          <w:pPr>
+            <w:pStyle w:val="Inhopg1"/>
+            <w:tabs>
+              <w:tab w:val="right" w:leader="dot" w:pos="9062"/>
+            </w:tabs>
+            <w:rPr>
+              <w:rFonts w:eastAsiaTheme="minorEastAsia" w:cstheme="minorBidi"/>
+              <w:noProof/>
+              <w:kern w:val="2"/>
+              <w:lang/>
+              <w14:ligatures w14:val="standardContextual"/>
+            </w:rPr>
+          </w:pPr>
+          <w:hyperlink w:anchor="_Toc228197965" w:history="1">
+            <w:r>
+              <w:rPr>
+                <w:rStyle w:val="Hyperlink"/>
+                <w:noProof/>
+                <w:lang w:val="en-GB"/>
+              </w:rPr>
+              <w:t xml:space="preserve">4. </w:t>
+            </w:r>
+            <w:r>
+              <w:rPr>
+                <w:rStyle w:val="Hyperlink"/>
+                <w:noProof/>
+                <w:lang/>
+              </w:rPr>
+              <w:t>Flow van een Payment Order</w:t>
+            </w:r>
+            <w:r>
+              <w:rPr>
+                <w:noProof/>
+                <w:webHidden/>
+              </w:rPr>
+              <w:tab/>
+            </w:r>
+            <w:r>
+              <w:rPr>
+                <w:noProof/>
+                <w:webHidden/>
+              </w:rPr>
+              <w:fldChar w:fldCharType="begin"/>
+            </w:r>
+            <w:r>
+              <w:rPr>
+                <w:noProof/>
+                <w:webHidden/>
+              </w:rPr>
+              <w:instrText xml:space="preserve"> PAGEREF _Toc228197965 \h </w:instrText>
+            </w:r>
+            <w:r>
+              <w:rPr>
+                <w:noProof/>
+                <w:webHidden/>
+              </w:rPr>
+            </w:r>
+            <w:r>
+              <w:rPr>
+                <w:noProof/>
+                <w:webHidden/>
+              </w:rPr>
+              <w:fldChar w:fldCharType="separate"/>
+            </w:r>
+            <w:r>
+              <w:rPr>
+                <w:noProof/>
+                <w:webHidden/>
+              </w:rPr>
+              <w:t>5</w:t>
+            </w:r>
+            <w:r>
+              <w:rPr>
+                <w:noProof/>
+                <w:webHidden/>
+              </w:rPr>
+              <w:fldChar w:fldCharType="end"/>
+            </w:r>
+          </w:hyperlink>
+        </w:p>
+        <w:p>
+          <w:pPr>
+            <w:pStyle w:val="Inhopg2"/>
+            <w:tabs>
+              <w:tab w:val="right" w:leader="dot" w:pos="9062"/>
+            </w:tabs>
+            <w:rPr>
+              <w:rFonts w:eastAsiaTheme="minorEastAsia" w:cstheme="minorBidi"/>
+              <w:noProof/>
+              <w:kern w:val="2"/>
+              <w:lang/>
+              <w14:ligatures w14:val="standardContextual"/>
+            </w:rPr>
+          </w:pPr>
+          <w:hyperlink w:anchor="_Toc228197966" w:history="1">
+            <w:r>
+              <w:rPr>
+                <w:rStyle w:val="Hyperlink"/>
+                <w:noProof/>
+              </w:rPr>
+              <w:t xml:space="preserve">4.1 </w:t>
+            </w:r>
+            <w:r>
+              <w:rPr>
+                <w:rStyle w:val="Hyperlink"/>
+                <w:noProof/>
+                <w:lang/>
+              </w:rPr>
+              <w:t>Flowchart die de stappen van een payment order doorheen het systeem illustreert</w:t>
+            </w:r>
+            <w:r>
+              <w:rPr>
+                <w:noProof/>
+                <w:webHidden/>
+              </w:rPr>
+              <w:tab/>
+            </w:r>
+            <w:r>
+              <w:rPr>
+                <w:noProof/>
+                <w:webHidden/>
+              </w:rPr>
+              <w:fldChar w:fldCharType="begin"/>
+            </w:r>
+            <w:r>
+              <w:rPr>
+                <w:noProof/>
+                <w:webHidden/>
+              </w:rPr>
+              <w:instrText xml:space="preserve"> PAGEREF _Toc228197966 \h </w:instrText>
+            </w:r>
+            <w:r>
+              <w:rPr>
+                <w:noProof/>
+                <w:webHidden/>
+              </w:rPr>
+            </w:r>
+            <w:r>
+              <w:rPr>
+                <w:noProof/>
+                <w:webHidden/>
+              </w:rPr>
+              <w:fldChar w:fldCharType="separate"/>
+            </w:r>
+            <w:r>
+              <w:rPr>
+                <w:noProof/>
+                <w:webHidden/>
+              </w:rPr>
+              <w:t>5</w:t>
+            </w:r>
+            <w:r>
+              <w:rPr>
+                <w:noProof/>
+                <w:webHidden/>
+              </w:rPr>
+              <w:fldChar w:fldCharType="end"/>
+            </w:r>
+          </w:hyperlink>
+        </w:p>
+        <w:p>
+          <w:pPr>
+            <w:pStyle w:val="Inhopg1"/>
+            <w:tabs>
+              <w:tab w:val="right" w:leader="dot" w:pos="9062"/>
+            </w:tabs>
+            <w:rPr>
+              <w:rFonts w:eastAsiaTheme="minorEastAsia" w:cstheme="minorBidi"/>
+              <w:noProof/>
+              <w:kern w:val="2"/>
+              <w:lang/>
+              <w14:ligatures w14:val="standardContextual"/>
+            </w:rPr>
+          </w:pPr>
+          <w:hyperlink w:anchor="_Toc228197967" w:history="1">
+            <w:r>
+              <w:rPr>
+                <w:rStyle w:val="Hyperlink"/>
+                <w:noProof/>
+              </w:rPr>
+              <w:t xml:space="preserve">5. </w:t>
+            </w:r>
+            <w:r>
+              <w:rPr>
+                <w:rStyle w:val="Hyperlink"/>
+                <w:noProof/>
+                <w:lang/>
+              </w:rPr>
+              <w:t>Beschrijving van het proces</w:t>
+            </w:r>
+            <w:r>
+              <w:rPr>
+                <w:noProof/>
+                <w:webHidden/>
+              </w:rPr>
+              <w:tab/>
+            </w:r>
+            <w:r>
+              <w:rPr>
+                <w:noProof/>
+                <w:webHidden/>
+              </w:rPr>
+              <w:fldChar w:fldCharType="begin"/>
+            </w:r>
+            <w:r>
+              <w:rPr>
+                <w:noProof/>
+                <w:webHidden/>
+              </w:rPr>
+              <w:instrText xml:space="preserve"> PAGEREF _Toc228197967 \h </w:instrText>
+            </w:r>
+            <w:r>
+              <w:rPr>
+                <w:noProof/>
+                <w:webHidden/>
+              </w:rPr>
+            </w:r>
+            <w:r>
+              <w:rPr>
+                <w:noProof/>
+                <w:webHidden/>
+              </w:rPr>
+              <w:fldChar w:fldCharType="separate"/>
+            </w:r>
+            <w:r>
+              <w:rPr>
+                <w:noProof/>
+                <w:webHidden/>
+              </w:rPr>
+              <w:t>5</w:t>
+            </w:r>
+            <w:r>
+              <w:rPr>
+                <w:noProof/>
+                <w:webHidden/>
+              </w:rPr>
+              <w:fldChar w:fldCharType="end"/>
+            </w:r>
+          </w:hyperlink>
+        </w:p>
+        <w:p>
+          <w:pPr>
+            <w:pStyle w:val="Inhopg2"/>
+            <w:tabs>
+              <w:tab w:val="right" w:leader="dot" w:pos="9062"/>
+            </w:tabs>
+            <w:rPr>
+              <w:rFonts w:eastAsiaTheme="minorEastAsia" w:cstheme="minorBidi"/>
+              <w:noProof/>
+              <w:kern w:val="2"/>
+              <w:lang/>
+              <w14:ligatures w14:val="standardContextual"/>
+            </w:rPr>
+          </w:pPr>
+          <w:hyperlink w:anchor="_Toc228197968" w:history="1">
+            <w:r>
+              <w:rPr>
+                <w:rStyle w:val="Hyperlink"/>
+                <w:noProof/>
+              </w:rPr>
+              <w:t xml:space="preserve">5.1 </w:t>
+            </w:r>
+            <w:r>
+              <w:rPr>
+                <w:rStyle w:val="Hyperlink"/>
+                <w:noProof/>
+                <w:lang/>
+              </w:rPr>
+              <w:t xml:space="preserve">Beschrijving plan van aanpak (uitgevoerde taken </w:t>
+            </w:r>
+            <w:r>
+              <w:rPr>
+                <w:rStyle w:val="Hyperlink"/>
+                <w:b/>
+                <w:bCs/>
+                <w:noProof/>
+                <w:lang/>
+              </w:rPr>
+              <w:t>per dag</w:t>
+            </w:r>
+            <w:r>
+              <w:rPr>
+                <w:rStyle w:val="Hyperlink"/>
+                <w:noProof/>
+                <w:lang/>
+              </w:rPr>
+              <w:t>, plan van aanpak, …)</w:t>
+            </w:r>
+            <w:r>
+              <w:rPr>
+                <w:noProof/>
+                <w:webHidden/>
+              </w:rPr>
+              <w:tab/>
+            </w:r>
+            <w:r>
+              <w:rPr>
+                <w:noProof/>
+                <w:webHidden/>
+              </w:rPr>
+              <w:fldChar w:fldCharType="begin"/>
+            </w:r>
+            <w:r>
+              <w:rPr>
+                <w:noProof/>
+                <w:webHidden/>
+              </w:rPr>
+              <w:instrText xml:space="preserve"> PAGEREF _Toc228197968 \h </w:instrText>
+            </w:r>
+            <w:r>
+              <w:rPr>
+                <w:noProof/>
+                <w:webHidden/>
+              </w:rPr>
+            </w:r>
+            <w:r>
+              <w:rPr>
+                <w:noProof/>
+                <w:webHidden/>
+              </w:rPr>
+              <w:fldChar w:fldCharType="separate"/>
+            </w:r>
+            <w:r>
+              <w:rPr>
+                <w:noProof/>
+                <w:webHidden/>
+              </w:rPr>
+              <w:t>5</w:t>
+            </w:r>
+            <w:r>
+              <w:rPr>
+                <w:noProof/>
+                <w:webHidden/>
+              </w:rPr>
+              <w:fldChar w:fldCharType="end"/>
+            </w:r>
+          </w:hyperlink>
+        </w:p>
+        <w:p>
+          <w:pPr>
+            <w:pStyle w:val="Inhopg2"/>
+            <w:tabs>
+              <w:tab w:val="right" w:leader="dot" w:pos="9062"/>
+            </w:tabs>
+            <w:rPr>
+              <w:rFonts w:eastAsiaTheme="minorEastAsia" w:cstheme="minorBidi"/>
+              <w:noProof/>
+              <w:kern w:val="2"/>
+              <w:lang/>
+              <w14:ligatures w14:val="standardContextual"/>
+            </w:rPr>
+          </w:pPr>
+          <w:hyperlink w:anchor="_Toc228197969" w:history="1">
+            <w:r>
+              <w:rPr>
+                <w:rStyle w:val="Hyperlink"/>
+                <w:noProof/>
+              </w:rPr>
+              <w:t xml:space="preserve">5.2 </w:t>
+            </w:r>
+            <w:r>
+              <w:rPr>
+                <w:rStyle w:val="Hyperlink"/>
+                <w:noProof/>
+                <w:lang/>
+              </w:rPr>
+              <w:t>Werkverdeling en planning</w:t>
+            </w:r>
+            <w:r>
+              <w:rPr>
+                <w:noProof/>
+                <w:webHidden/>
+              </w:rPr>
+              <w:tab/>
+            </w:r>
+            <w:r>
+              <w:rPr>
+                <w:noProof/>
+                <w:webHidden/>
+              </w:rPr>
+              <w:fldChar w:fldCharType="begin"/>
+            </w:r>
+            <w:r>
+              <w:rPr>
+                <w:noProof/>
+                <w:webHidden/>
+              </w:rPr>
+              <w:instrText xml:space="preserve"> PAGEREF _Toc228197969 \h </w:instrText>
+            </w:r>
+            <w:r>
+              <w:rPr>
+                <w:noProof/>
+                <w:webHidden/>
+              </w:rPr>
+            </w:r>
+            <w:r>
+              <w:rPr>
+                <w:noProof/>
+                <w:webHidden/>
+              </w:rPr>
+              <w:fldChar w:fldCharType="separate"/>
+            </w:r>
+            <w:r>
+              <w:rPr>
+                <w:noProof/>
+                <w:webHidden/>
+              </w:rPr>
+              <w:t>5</w:t>
+            </w:r>
+            <w:r>
+              <w:rPr>
+                <w:noProof/>
+                <w:webHidden/>
+              </w:rPr>
+              <w:fldChar w:fldCharType="end"/>
+            </w:r>
+          </w:hyperlink>
+        </w:p>
+        <w:p>
+          <w:pPr>
+            <w:pStyle w:val="Inhopg2"/>
+            <w:tabs>
+              <w:tab w:val="right" w:leader="dot" w:pos="9062"/>
+            </w:tabs>
+            <w:rPr>
+              <w:rFonts w:eastAsiaTheme="minorEastAsia" w:cstheme="minorBidi"/>
+              <w:noProof/>
+              <w:kern w:val="2"/>
+              <w:lang/>
+              <w14:ligatures w14:val="standardContextual"/>
+            </w:rPr>
+          </w:pPr>
+          <w:hyperlink w:anchor="_Toc228197970" w:history="1">
+            <w:r>
+              <w:rPr>
+                <w:rStyle w:val="Hyperlink"/>
+                <w:noProof/>
+                <w:lang w:val="fr-BE"/>
+              </w:rPr>
+              <w:t xml:space="preserve">5.3 </w:t>
+            </w:r>
+            <w:r>
+              <w:rPr>
+                <w:rStyle w:val="Hyperlink"/>
+                <w:noProof/>
+                <w:lang/>
+              </w:rPr>
+              <w:t>Problemen en oplossingen</w:t>
+            </w:r>
+            <w:r>
+              <w:rPr>
+                <w:noProof/>
+                <w:webHidden/>
+              </w:rPr>
+              <w:tab/>
+            </w:r>
+            <w:r>
+              <w:rPr>
+                <w:noProof/>
+                <w:webHidden/>
+              </w:rPr>
+              <w:fldChar w:fldCharType="begin"/>
+            </w:r>
+            <w:r>
+              <w:rPr>
+                <w:noProof/>
+                <w:webHidden/>
+              </w:rPr>
+              <w:instrText xml:space="preserve"> PAGEREF _Toc228197970 \h </w:instrText>
+            </w:r>
+            <w:r>
+              <w:rPr>
+                <w:noProof/>
+                <w:webHidden/>
+              </w:rPr>
+            </w:r>
+            <w:r>
+              <w:rPr>
+                <w:noProof/>
+                <w:webHidden/>
+              </w:rPr>
+              <w:fldChar w:fldCharType="separate"/>
+            </w:r>
+            <w:r>
+              <w:rPr>
+                <w:noProof/>
+                <w:webHidden/>
+              </w:rPr>
+              <w:t>5</w:t>
+            </w:r>
+            <w:r>
+              <w:rPr>
+                <w:noProof/>
+                <w:webHidden/>
+              </w:rPr>
+              <w:fldChar w:fldCharType="end"/>
+            </w:r>
+          </w:hyperlink>
+        </w:p>
+        <w:p>
+          <w:pPr>
+            <w:pStyle w:val="Inhopg1"/>
+            <w:tabs>
+              <w:tab w:val="right" w:leader="dot" w:pos="9062"/>
+            </w:tabs>
+            <w:rPr>
+              <w:rFonts w:eastAsiaTheme="minorEastAsia" w:cstheme="minorBidi"/>
+              <w:noProof/>
+              <w:kern w:val="2"/>
+              <w:lang/>
+              <w14:ligatures w14:val="standardContextual"/>
+            </w:rPr>
+          </w:pPr>
+          <w:hyperlink w:anchor="_Toc228197971" w:history="1">
+            <w:r>
+              <w:rPr>
+                <w:rStyle w:val="Hyperlink"/>
+                <w:noProof/>
+              </w:rPr>
+              <w:t>6.</w:t>
+            </w:r>
+            <w:r>
+              <w:rPr>
+                <w:rStyle w:val="Hyperlink"/>
+                <w:noProof/>
+                <w:lang/>
+              </w:rPr>
+              <w:t>Handleiding voor het gebruik van de GUI</w:t>
+            </w:r>
+            <w:r>
+              <w:rPr>
+                <w:noProof/>
+                <w:webHidden/>
+              </w:rPr>
+              <w:tab/>
+            </w:r>
+            <w:r>
+              <w:rPr>
+                <w:noProof/>
+                <w:webHidden/>
+              </w:rPr>
+              <w:fldChar w:fldCharType="begin"/>
+            </w:r>
+            <w:r>
+              <w:rPr>
+                <w:noProof/>
+                <w:webHidden/>
+              </w:rPr>
+              <w:instrText xml:space="preserve"> PAGEREF _Toc228197971 \h </w:instrText>
+            </w:r>
+            <w:r>
+              <w:rPr>
+                <w:noProof/>
+                <w:webHidden/>
+              </w:rPr>
+            </w:r>
+            <w:r>
+              <w:rPr>
+                <w:noProof/>
+                <w:webHidden/>
+              </w:rPr>
+              <w:fldChar w:fldCharType="separate"/>
+            </w:r>
+            <w:r>
+              <w:rPr>
+                <w:noProof/>
+                <w:webHidden/>
+              </w:rPr>
+              <w:t>5</w:t>
+            </w:r>
+            <w:r>
+              <w:rPr>
+                <w:noProof/>
+                <w:webHidden/>
+              </w:rPr>
+              <w:fldChar w:fldCharType="end"/>
+            </w:r>
+          </w:hyperlink>
+        </w:p>
+        <w:p>
+          <w:pPr>
+            <w:pStyle w:val="Inhopg2"/>
+            <w:tabs>
+              <w:tab w:val="right" w:leader="dot" w:pos="9062"/>
+            </w:tabs>
+            <w:rPr>
+              <w:rFonts w:eastAsiaTheme="minorEastAsia" w:cstheme="minorBidi"/>
+              <w:noProof/>
+              <w:kern w:val="2"/>
+              <w:lang/>
+              <w14:ligatures w14:val="standardContextual"/>
+            </w:rPr>
+          </w:pPr>
+          <w:hyperlink w:anchor="_Toc228197972" w:history="1">
+            <w:r>
+              <w:rPr>
+                <w:rStyle w:val="Hyperlink"/>
+                <w:noProof/>
+              </w:rPr>
+              <w:t xml:space="preserve">6.1 </w:t>
+            </w:r>
+            <w:r>
+              <w:rPr>
+                <w:rStyle w:val="Hyperlink"/>
+                <w:noProof/>
+                <w:lang/>
+              </w:rPr>
+              <w:t>Functionaliteiten van de GUI</w:t>
+            </w:r>
+            <w:r>
+              <w:rPr>
+                <w:noProof/>
+                <w:webHidden/>
+              </w:rPr>
+              <w:tab/>
+            </w:r>
+            <w:r>
+              <w:rPr>
+                <w:noProof/>
+                <w:webHidden/>
+              </w:rPr>
+              <w:fldChar w:fldCharType="begin"/>
+            </w:r>
+            <w:r>
+              <w:rPr>
+                <w:noProof/>
+                <w:webHidden/>
+              </w:rPr>
+              <w:instrText xml:space="preserve"> PAGEREF _Toc228197972 \h </w:instrText>
+            </w:r>
+            <w:r>
+              <w:rPr>
+                <w:noProof/>
+                <w:webHidden/>
+              </w:rPr>
+            </w:r>
+            <w:r>
+              <w:rPr>
+                <w:noProof/>
+                <w:webHidden/>
+              </w:rPr>
+              <w:fldChar w:fldCharType="separate"/>
+            </w:r>
+            <w:r>
+              <w:rPr>
+                <w:noProof/>
+                <w:webHidden/>
+              </w:rPr>
+              <w:t>5</w:t>
+            </w:r>
+            <w:r>
+              <w:rPr>
+                <w:noProof/>
+                <w:webHidden/>
+              </w:rPr>
+              <w:fldChar w:fldCharType="end"/>
+            </w:r>
+          </w:hyperlink>
+        </w:p>
+        <w:p>
+          <w:pPr>
+            <w:pStyle w:val="Inhopg2"/>
+            <w:tabs>
+              <w:tab w:val="right" w:leader="dot" w:pos="9062"/>
+            </w:tabs>
+            <w:rPr>
+              <w:rFonts w:eastAsiaTheme="minorEastAsia" w:cstheme="minorBidi"/>
+              <w:noProof/>
+              <w:kern w:val="2"/>
+              <w:lang/>
+              <w14:ligatures w14:val="standardContextual"/>
+            </w:rPr>
+          </w:pPr>
+          <w:hyperlink w:anchor="_Toc228197973" w:history="1">
+            <w:r>
+              <w:rPr>
+                <w:rStyle w:val="Hyperlink"/>
+                <w:noProof/>
+              </w:rPr>
+              <w:t xml:space="preserve">6.2 </w:t>
+            </w:r>
+            <w:r>
+              <w:rPr>
+                <w:rStyle w:val="Hyperlink"/>
+                <w:noProof/>
+                <w:lang/>
+              </w:rPr>
+              <w:t>Gebruiksinstructies (inclusief screenshots)</w:t>
+            </w:r>
+            <w:r>
+              <w:rPr>
+                <w:noProof/>
+                <w:webHidden/>
+              </w:rPr>
+              <w:tab/>
+            </w:r>
+            <w:r>
+              <w:rPr>
+                <w:noProof/>
+                <w:webHidden/>
+              </w:rPr>
+              <w:fldChar w:fldCharType="begin"/>
+            </w:r>
+            <w:r>
+              <w:rPr>
+                <w:noProof/>
+                <w:webHidden/>
+              </w:rPr>
+              <w:instrText xml:space="preserve"> PAGEREF _Toc228197973 \h </w:instrText>
+            </w:r>
+            <w:r>
+              <w:rPr>
+                <w:noProof/>
+                <w:webHidden/>
+              </w:rPr>
+            </w:r>
+            <w:r>
+              <w:rPr>
+                <w:noProof/>
+                <w:webHidden/>
+              </w:rPr>
+              <w:fldChar w:fldCharType="separate"/>
+            </w:r>
+            <w:r>
+              <w:rPr>
+                <w:noProof/>
+                <w:webHidden/>
+              </w:rPr>
+              <w:t>5</w:t>
+            </w:r>
+            <w:r>
+              <w:rPr>
+                <w:noProof/>
+                <w:webHidden/>
+              </w:rPr>
+              <w:fldChar w:fldCharType="end"/>
+            </w:r>
+          </w:hyperlink>
+        </w:p>
+        <w:p>
+          <w:pPr>
+            <w:pStyle w:val="Inhopg1"/>
+            <w:tabs>
+              <w:tab w:val="right" w:leader="dot" w:pos="9062"/>
+            </w:tabs>
+            <w:rPr>
+              <w:rFonts w:eastAsiaTheme="minorEastAsia" w:cstheme="minorBidi"/>
+              <w:noProof/>
+              <w:kern w:val="2"/>
+              <w:lang/>
+              <w14:ligatures w14:val="standardContextual"/>
+            </w:rPr>
+          </w:pPr>
+          <w:hyperlink w:anchor="_Toc228197974" w:history="1">
+            <w:r>
+              <w:rPr>
+                <w:rStyle w:val="Hyperlink"/>
+                <w:noProof/>
+              </w:rPr>
+              <w:t>7. Reflectie</w:t>
+            </w:r>
+            <w:r>
+              <w:rPr>
+                <w:noProof/>
+                <w:webHidden/>
+              </w:rPr>
+              <w:tab/>
+            </w:r>
+            <w:r>
+              <w:rPr>
+                <w:noProof/>
+                <w:webHidden/>
+              </w:rPr>
+              <w:fldChar w:fldCharType="begin"/>
+            </w:r>
+            <w:r>
+              <w:rPr>
+                <w:noProof/>
+                <w:webHidden/>
+              </w:rPr>
+              <w:instrText xml:space="preserve"> PAGEREF _Toc228197974 \h </w:instrText>
+            </w:r>
+            <w:r>
+              <w:rPr>
+                <w:noProof/>
+                <w:webHidden/>
+              </w:rPr>
+            </w:r>
+            <w:r>
+              <w:rPr>
+                <w:noProof/>
+                <w:webHidden/>
+              </w:rPr>
+              <w:fldChar w:fldCharType="separate"/>
+            </w:r>
+            <w:r>
+              <w:rPr>
+                <w:noProof/>
+                <w:webHidden/>
+              </w:rPr>
+              <w:t>5</w:t>
+            </w:r>
+            <w:r>
+              <w:rPr>
+                <w:noProof/>
+                <w:webHidden/>
+              </w:rPr>
+              <w:fldChar w:fldCharType="end"/>
+            </w:r>
+          </w:hyperlink>
+        </w:p>
+        <w:p>
+          <w:pPr>
+            <w:pStyle w:val="Inhopg1"/>
+            <w:tabs>
+              <w:tab w:val="right" w:leader="dot" w:pos="9062"/>
+            </w:tabs>
+            <w:rPr>
+              <w:rFonts w:eastAsiaTheme="minorEastAsia" w:cstheme="minorBidi"/>
+              <w:noProof/>
+              <w:kern w:val="2"/>
+              <w:lang/>
+              <w14:ligatures w14:val="standardContextual"/>
+            </w:rPr>
+          </w:pPr>
+          <w:hyperlink w:anchor="_Toc228197975" w:history="1">
+            <w:r>
+              <w:rPr>
+                <w:rStyle w:val="Hyperlink"/>
+                <w:noProof/>
+              </w:rPr>
+              <w:t>8. Bijlagen</w:t>
+            </w:r>
+            <w:r>
+              <w:rPr>
+                <w:noProof/>
+                <w:webHidden/>
+              </w:rPr>
+              <w:tab/>
+            </w:r>
+            <w:r>
+              <w:rPr>
+                <w:noProof/>
+                <w:webHidden/>
+              </w:rPr>
+              <w:fldChar w:fldCharType="begin"/>
+            </w:r>
+            <w:r>
+              <w:rPr>
+                <w:noProof/>
+                <w:webHidden/>
+              </w:rPr>
+              <w:instrText xml:space="preserve"> PAGEREF _Toc228197975 \h </w:instrText>
+            </w:r>
+            <w:r>
+              <w:rPr>
+                <w:noProof/>
+                <w:webHidden/>
+              </w:rPr>
+            </w:r>
+            <w:r>
+              <w:rPr>
+                <w:noProof/>
+                <w:webHidden/>
+              </w:rPr>
+              <w:fldChar w:fldCharType="separate"/>
+            </w:r>
+            <w:r>
+              <w:rPr>
+                <w:noProof/>
+                <w:webHidden/>
+              </w:rPr>
+              <w:t>5</w:t>
             </w:r>
             <w:r>
               <w:rPr>
@@ -807,33 +2431,571 @@
       <w:pPr>
         <w:pStyle w:val="Kop1"/>
       </w:pPr>
+      <w:bookmarkStart w:id="0" w:name="_Toc228197955"/>
       <w:r>
         <w:lastRenderedPageBreak/>
+        <w:t xml:space="preserve">1. </w:t>
+      </w:r>
+      <w:r>
         <w:t>I</w:t>
       </w:r>
       <w:r>
         <w:t>nleiding</w:t>
       </w:r>
+      <w:bookmarkEnd w:id="0"/>
     </w:p>
     <w:p>
-      <w:r>
-        <w:t>Dit project kadert binnen de workshop PingFin, waarin we een vereenvoudigde versie van een SEPA-betalingssysteem gaan ontwikkelen. Het doel van deze workshop is om inzicht te krijgen in hoe banken onderling gaan communiceren bij het verwerken van betalingen. In dit systeem spelen verschillende partijen een rol: een originator bank (OB), een clearing bank (CB) en een beneficiary bank (BB). Betalingen worden niet rechtstreeks tussen banken verstuurd, maar verlopen eerst via de clearing bank, die zich voorstelt als tussenpersoon en verantwoordelijk is voor de verwerking en validatie van berichten.</w:t>
-      </w:r>
+      <w:pPr>
+        <w:pStyle w:val="Kop2"/>
+      </w:pPr>
+      <w:bookmarkStart w:id="1" w:name="_Toc228197956"/>
+      <w:r>
+        <w:rPr>
+          <w:lang w:val="fr-BE"/>
+        </w:rPr>
+        <w:t xml:space="preserve">1.1 </w:t>
+      </w:r>
+      <w:r>
+        <w:rPr>
+          <w:lang/>
+        </w:rPr>
+        <w:t>Beschrijving van het project</w:t>
+      </w:r>
+      <w:bookmarkEnd w:id="1"/>
     </w:p>
     <w:p>
       <w:r>
-        <w:t>Tijdens deze workshop werken we in teamver aan het opbouwen van een volledig werkende applicatie. Dit bestaat uit het ontwerpen van een database, het ontwikkelen van een API voor communicatie tussen banken en het bouwen van een eenvoudige gebruikersinterface. Daarnaast is er ook aandacht voor testing, foutafhandeling en logging, zodat het systeem niet alleen functioneel maar ook betrouwbaar is.</w:t>
+        <w:t>In dit project simuleren we een betalingssysteem waarbij verschillende banken met elkaar communiceren via een centrale clearing bank. Er zijn drie belangrijke partijen</w:t>
+      </w:r>
+      <w:r>
+        <w:t xml:space="preserve">, we hebben </w:t>
+      </w:r>
+      <w:r>
+        <w:t xml:space="preserve">de </w:t>
+      </w:r>
+      <w:proofErr w:type="spellStart"/>
+      <w:r>
+        <w:t>originator</w:t>
+      </w:r>
+      <w:proofErr w:type="spellEnd"/>
+      <w:r>
+        <w:t xml:space="preserve"> bank (OB), de clearing bank (CB) en de </w:t>
+      </w:r>
+      <w:proofErr w:type="spellStart"/>
+      <w:r>
+        <w:t>beneficiary</w:t>
+      </w:r>
+      <w:proofErr w:type="spellEnd"/>
+      <w:r>
+        <w:t xml:space="preserve"> bank (BB).</w:t>
       </w:r>
     </w:p>
     <w:p>
       <w:r>
-        <w:t>Binnen ons team hebben we de taken verdeeld op basis van ieders sterktes. Zo zijn er teamleden die zich focussen op de backend en API-ontwikkeling, anderen op de database en datamodel  als laatst iemand die zich bezighoudt met de frontend en gebruikersinterface. Er wordt ook aandacht besteed aan testing en documentatie, zodat het volledige proces goed opgevolgd en gedocumenteerd wordt.</w:t>
+        <w:t xml:space="preserve">Wanneer een betaling wordt gestart bij de </w:t>
+      </w:r>
+      <w:proofErr w:type="spellStart"/>
+      <w:r>
+        <w:t>originator</w:t>
+      </w:r>
+      <w:proofErr w:type="spellEnd"/>
+      <w:r>
+        <w:t xml:space="preserve"> bank</w:t>
+      </w:r>
+      <w:r>
+        <w:t xml:space="preserve"> </w:t>
+      </w:r>
+      <w:r>
+        <w:t xml:space="preserve">wordt deze niet rechtstreeks naar de andere bank gestuurd, maar eerst doorgestuurd naar de clearing bank. Deze </w:t>
+      </w:r>
+      <w:r>
+        <w:t>dient</w:t>
+      </w:r>
+      <w:r>
+        <w:t xml:space="preserve"> als tussenpersoon en controleert</w:t>
+      </w:r>
+      <w:r>
+        <w:t xml:space="preserve">/ </w:t>
+      </w:r>
+      <w:proofErr w:type="spellStart"/>
+      <w:r>
+        <w:t>valideertde</w:t>
+      </w:r>
+      <w:proofErr w:type="spellEnd"/>
+      <w:r>
+        <w:t xml:space="preserve"> betaling voordat deze eventueel verder wordt gestuurd naar de </w:t>
+      </w:r>
+      <w:proofErr w:type="spellStart"/>
+      <w:r>
+        <w:t>beneficiary</w:t>
+      </w:r>
+      <w:proofErr w:type="spellEnd"/>
+      <w:r>
+        <w:t xml:space="preserve"> bank.</w:t>
       </w:r>
     </w:p>
     <w:p>
       <w:r>
-        <w:t>Naast de technische uitwerking is ook samenwerking een belangrijk onderdeel van dit project. We maken gebruik van tools zoals GitHub voor versiebeheer en een Trello-bord om onze taken te organiseren en de voortgang bij te houden. Op die manier proberen we gestructureerd en efficiënt te werken.</w:t>
-      </w:r>
+        <w:t>Tijdens de workshop bouwen we zelf een applicatie die dit proces na</w:t>
+      </w:r>
+      <w:r>
+        <w:t>doet</w:t>
+      </w:r>
+      <w:r>
+        <w:t xml:space="preserve">. Dit </w:t>
+      </w:r>
+      <w:r>
+        <w:t>bevat</w:t>
+      </w:r>
+      <w:r>
+        <w:t xml:space="preserve"> het ontwerpen van een database, het ontwikkelen van een API voor communicatie tussen de banken en het bouwen van een eenvoudige gebruikersinterface. Daarnaast besteden we ook aandacht aan </w:t>
+      </w:r>
+      <w:proofErr w:type="spellStart"/>
+      <w:r>
+        <w:t>testing</w:t>
+      </w:r>
+      <w:proofErr w:type="spellEnd"/>
+      <w:r>
+        <w:t xml:space="preserve">, foutafhandeling en </w:t>
+      </w:r>
+      <w:proofErr w:type="spellStart"/>
+      <w:r>
+        <w:t>logging</w:t>
+      </w:r>
+      <w:proofErr w:type="spellEnd"/>
+      <w:r>
+        <w:t>, zodat het systeem betrouwbaar werkt.</w:t>
+      </w:r>
+    </w:p>
+    <w:p>
+      <w:pPr>
+        <w:pStyle w:val="Kop2"/>
+      </w:pPr>
+      <w:bookmarkStart w:id="2" w:name="_Toc228197957"/>
+      <w:r>
+        <w:t xml:space="preserve">1.2 </w:t>
+      </w:r>
+      <w:r>
+        <w:t>Doel van het project</w:t>
+      </w:r>
+      <w:bookmarkEnd w:id="2"/>
+    </w:p>
+    <w:p>
+      <w:r>
+        <w:t xml:space="preserve">Het doel van dit project is om inzicht te krijgen in hoe een betalingssysteem werkt en hoe verschillende systemen met elkaar communiceren via </w:t>
+      </w:r>
+      <w:proofErr w:type="spellStart"/>
+      <w:r>
+        <w:t>API’s</w:t>
+      </w:r>
+      <w:proofErr w:type="spellEnd"/>
+      <w:r>
+        <w:t>. Daarnaast leren we hoe we een applicatie moeten opbouwen volgens een gestructureerde aanpak</w:t>
+      </w:r>
+      <w:r>
+        <w:t xml:space="preserve"> </w:t>
+      </w:r>
+      <w:r>
+        <w:t>waarbij backend, database en frontend samenwerken.</w:t>
+      </w:r>
+    </w:p>
+    <w:p>
+      <w:r>
+        <w:t xml:space="preserve">Een ander belangrijk doel is het ontwikkelen van samenwerkingsvaardigheden. Door te werken met tools zoals GitHub en </w:t>
+      </w:r>
+      <w:proofErr w:type="spellStart"/>
+      <w:r>
+        <w:t>Trello</w:t>
+      </w:r>
+      <w:proofErr w:type="spellEnd"/>
+      <w:r>
+        <w:t xml:space="preserve"> leren we hoe we taken verdelen, voortgang opvolgen en efficiënt samenwerken binnen een team, zoals dat ook </w:t>
+      </w:r>
+      <w:r>
+        <w:t xml:space="preserve">het geval later zal zijn </w:t>
+      </w:r>
+      <w:r>
+        <w:t xml:space="preserve">in een professionele werkomgeving </w:t>
+      </w:r>
+      <w:r>
+        <w:t>.</w:t>
+      </w:r>
+    </w:p>
+    <w:p>
+      <w:pPr>
+        <w:pStyle w:val="Kop1"/>
+        <w:rPr>
+          <w:b/>
+          <w:bCs/>
+        </w:rPr>
+      </w:pPr>
+      <w:bookmarkStart w:id="3" w:name="_Toc228197958"/>
+      <w:r>
+        <w:rPr>
+          <w:b/>
+          <w:bCs/>
+        </w:rPr>
+        <w:lastRenderedPageBreak/>
+        <w:t xml:space="preserve">2. </w:t>
+      </w:r>
+      <w:r>
+        <w:rPr>
+          <w:b/>
+          <w:bCs/>
+        </w:rPr>
+        <w:t>Schema van de opbouw van het project</w:t>
+      </w:r>
+      <w:bookmarkEnd w:id="3"/>
+    </w:p>
+    <w:p>
+      <w:pPr>
+        <w:pStyle w:val="Kop2"/>
+      </w:pPr>
+      <w:bookmarkStart w:id="4" w:name="_Toc228197959"/>
+      <w:r>
+        <w:t xml:space="preserve">2.1 </w:t>
+      </w:r>
+      <w:r>
+        <w:rPr>
+          <w:lang/>
+        </w:rPr>
+        <w:t>Communicatie tussen GUI en API</w:t>
+      </w:r>
+      <w:bookmarkEnd w:id="4"/>
+    </w:p>
+    <w:p>
+      <w:pPr>
+        <w:pStyle w:val="Kop2"/>
+      </w:pPr>
+      <w:bookmarkStart w:id="5" w:name="_Toc228197960"/>
+      <w:r>
+        <w:t>2.2</w:t>
+      </w:r>
+      <w:r>
+        <w:t xml:space="preserve"> </w:t>
+      </w:r>
+      <w:r>
+        <w:rPr>
+          <w:lang/>
+        </w:rPr>
+        <w:t>Databankstructuur</w:t>
+      </w:r>
+      <w:bookmarkEnd w:id="5"/>
+    </w:p>
+    <w:p>
+      <w:pPr>
+        <w:pStyle w:val="Kop1"/>
+      </w:pPr>
+      <w:bookmarkStart w:id="6" w:name="_Toc228197961"/>
+      <w:r>
+        <w:t xml:space="preserve">3. </w:t>
+      </w:r>
+      <w:r>
+        <w:t>Documentatie van de API</w:t>
+      </w:r>
+      <w:bookmarkEnd w:id="6"/>
+    </w:p>
+    <w:p>
+      <w:pPr>
+        <w:pStyle w:val="Kop2"/>
+        <w:rPr>
+          <w:lang/>
+        </w:rPr>
+      </w:pPr>
+      <w:bookmarkStart w:id="7" w:name="_Toc228197962"/>
+      <w:r>
+        <w:t xml:space="preserve">3.1 </w:t>
+      </w:r>
+      <w:r>
+        <w:rPr>
+          <w:lang/>
+        </w:rPr>
+        <w:t>Beschrijving van API endpoints</w:t>
+      </w:r>
+      <w:bookmarkEnd w:id="7"/>
+    </w:p>
+    <w:p>
+      <w:pPr>
+        <w:pStyle w:val="Kop2"/>
+        <w:rPr>
+          <w:lang/>
+        </w:rPr>
+      </w:pPr>
+      <w:bookmarkStart w:id="8" w:name="_Toc228197963"/>
+      <w:r>
+        <w:t xml:space="preserve">3.2 </w:t>
+      </w:r>
+      <w:r>
+        <w:rPr>
+          <w:lang/>
+        </w:rPr>
+        <w:t>Informatie over gebruikte methoden en parameters</w:t>
+      </w:r>
+      <w:bookmarkEnd w:id="8"/>
+    </w:p>
+    <w:p>
+      <w:pPr>
+        <w:pStyle w:val="Kop2"/>
+        <w:rPr>
+          <w:lang w:val="fr-BE"/>
+        </w:rPr>
+      </w:pPr>
+      <w:bookmarkStart w:id="9" w:name="_Toc228197964"/>
+      <w:r>
+        <w:t xml:space="preserve">3.3 </w:t>
+      </w:r>
+      <w:r>
+        <w:rPr>
+          <w:lang/>
+        </w:rPr>
+        <w:t>Voorbeeldgebruik met Postman of vergelijkbare tool</w:t>
+      </w:r>
+      <w:bookmarkEnd w:id="9"/>
+    </w:p>
+    <w:p>
+      <w:pPr>
+        <w:pStyle w:val="Kop1"/>
+        <w:rPr>
+          <w:lang/>
+        </w:rPr>
+      </w:pPr>
+      <w:bookmarkStart w:id="10" w:name="_Toc228197965"/>
+      <w:r>
+        <w:rPr>
+          <w:lang w:val="en-GB"/>
+        </w:rPr>
+        <w:t xml:space="preserve">4. </w:t>
+      </w:r>
+      <w:r>
+        <w:rPr>
+          <w:lang/>
+        </w:rPr>
+        <w:t>Flow van een Payment Order</w:t>
+      </w:r>
+      <w:bookmarkEnd w:id="10"/>
+    </w:p>
+    <w:p>
+      <w:pPr>
+        <w:pStyle w:val="Kop2"/>
+        <w:rPr>
+          <w:lang w:val="fr-BE"/>
+        </w:rPr>
+      </w:pPr>
+      <w:bookmarkStart w:id="11" w:name="_Toc228197966"/>
+      <w:r>
+        <w:t>4.</w:t>
+      </w:r>
+      <w:r>
+        <w:t xml:space="preserve">1 </w:t>
+      </w:r>
+      <w:r>
+        <w:rPr>
+          <w:lang/>
+        </w:rPr>
+        <w:t>Flowchart die de stappen van een payment order doorheen het systeem illustreert</w:t>
+      </w:r>
+      <w:bookmarkEnd w:id="11"/>
+    </w:p>
+    <w:p>
+      <w:pPr>
+        <w:pStyle w:val="Kop1"/>
+        <w:rPr>
+          <w:lang/>
+        </w:rPr>
+      </w:pPr>
+      <w:bookmarkStart w:id="12" w:name="_Toc228197967"/>
+      <w:r>
+        <w:t xml:space="preserve">5. </w:t>
+      </w:r>
+      <w:r>
+        <w:rPr>
+          <w:lang/>
+        </w:rPr>
+        <w:t>Beschrijving van het proces</w:t>
+      </w:r>
+      <w:bookmarkEnd w:id="12"/>
+    </w:p>
+    <w:p>
+      <w:pPr>
+        <w:pStyle w:val="Kop2"/>
+        <w:rPr>
+          <w:lang/>
+        </w:rPr>
+      </w:pPr>
+      <w:bookmarkStart w:id="13" w:name="_Toc228197968"/>
+      <w:r>
+        <w:t>5.</w:t>
+      </w:r>
+      <w:r>
+        <w:t xml:space="preserve">1 </w:t>
+      </w:r>
+      <w:r>
+        <w:rPr>
+          <w:lang/>
+        </w:rPr>
+        <w:t xml:space="preserve">Beschrijving plan van aanpak (uitgevoerde taken </w:t>
+      </w:r>
+      <w:r>
+        <w:rPr>
+          <w:b/>
+          <w:bCs/>
+          <w:lang/>
+        </w:rPr>
+        <w:t>per dag</w:t>
+      </w:r>
+      <w:r>
+        <w:rPr>
+          <w:lang/>
+        </w:rPr>
+        <w:t>, plan van aanpak, …)</w:t>
+      </w:r>
+      <w:bookmarkEnd w:id="13"/>
+    </w:p>
+    <w:p>
+      <w:pPr>
+        <w:pStyle w:val="Kop2"/>
+        <w:rPr>
+          <w:lang/>
+        </w:rPr>
+      </w:pPr>
+      <w:bookmarkStart w:id="14" w:name="_Toc228197969"/>
+      <w:r>
+        <w:t xml:space="preserve">5.2 </w:t>
+      </w:r>
+      <w:r>
+        <w:rPr>
+          <w:lang/>
+        </w:rPr>
+        <w:t>Werkverdeling en planning</w:t>
+      </w:r>
+      <w:bookmarkEnd w:id="14"/>
+    </w:p>
+    <w:p>
+      <w:pPr>
+        <w:pStyle w:val="Kop2"/>
+        <w:rPr>
+          <w:lang w:val="fr-BE"/>
+        </w:rPr>
+      </w:pPr>
+      <w:bookmarkStart w:id="15" w:name="_Toc228197970"/>
+      <w:r>
+        <w:rPr>
+          <w:lang w:val="fr-BE"/>
+        </w:rPr>
+        <w:t xml:space="preserve">5.3 </w:t>
+      </w:r>
+      <w:r>
+        <w:rPr>
+          <w:lang/>
+        </w:rPr>
+        <w:t>Problemen en oplossingen</w:t>
+      </w:r>
+      <w:bookmarkEnd w:id="15"/>
+    </w:p>
+    <w:p>
+      <w:pPr>
+        <w:pStyle w:val="Kop1"/>
+        <w:rPr>
+          <w:lang/>
+        </w:rPr>
+      </w:pPr>
+      <w:bookmarkStart w:id="16" w:name="_Toc228197971"/>
+      <w:r>
+        <w:t>6.</w:t>
+      </w:r>
+      <w:r>
+        <w:rPr>
+          <w:lang/>
+        </w:rPr>
+        <w:t>Handleiding voor het gebruik van de GUI</w:t>
+      </w:r>
+      <w:bookmarkEnd w:id="16"/>
+    </w:p>
+    <w:p>
+      <w:pPr>
+        <w:pStyle w:val="Kop2"/>
+        <w:rPr>
+          <w:lang/>
+        </w:rPr>
+      </w:pPr>
+      <w:bookmarkStart w:id="17" w:name="_Toc228197972"/>
+      <w:r>
+        <w:t xml:space="preserve">6.1 </w:t>
+      </w:r>
+      <w:r>
+        <w:rPr>
+          <w:lang/>
+        </w:rPr>
+        <w:t>Functionaliteiten van de GUI</w:t>
+      </w:r>
+      <w:bookmarkEnd w:id="17"/>
+    </w:p>
+    <w:p>
+      <w:pPr>
+        <w:pStyle w:val="Kop2"/>
+      </w:pPr>
+      <w:bookmarkStart w:id="18" w:name="_Toc228197973"/>
+      <w:r>
+        <w:t>6.2</w:t>
+      </w:r>
+      <w:r>
+        <w:t xml:space="preserve"> </w:t>
+      </w:r>
+      <w:r>
+        <w:rPr>
+          <w:lang/>
+        </w:rPr>
+        <w:t>Gebruiksinstructies (inclusief screenshots)</w:t>
+      </w:r>
+      <w:bookmarkEnd w:id="18"/>
+    </w:p>
+    <w:p>
+      <w:pPr>
+        <w:pStyle w:val="Kop1"/>
+      </w:pPr>
+      <w:bookmarkStart w:id="19" w:name="_Toc228197974"/>
+      <w:r>
+        <w:t xml:space="preserve">7. </w:t>
+      </w:r>
+      <w:r>
+        <w:t>Reflectie</w:t>
+      </w:r>
+      <w:bookmarkEnd w:id="19"/>
+    </w:p>
+    <w:p>
+      <w:pPr>
+        <w:pStyle w:val="Kop1"/>
+      </w:pPr>
+      <w:bookmarkStart w:id="20" w:name="_Toc228197975"/>
+      <w:r>
+        <w:t xml:space="preserve">8. </w:t>
+      </w:r>
+      <w:r>
+        <w:t>Bijlagen</w:t>
+      </w:r>
+      <w:bookmarkEnd w:id="20"/>
+    </w:p>
+    <w:p/>
+    <w:p/>
+    <w:p>
+      <w:pPr>
+        <w:rPr>
+          <w:lang/>
+        </w:rPr>
+      </w:pPr>
+    </w:p>
+    <w:p>
+      <w:pPr>
+        <w:rPr>
+          <w:lang/>
+        </w:rPr>
+      </w:pPr>
+    </w:p>
+    <w:p/>
+    <w:p>
+      <w:pPr>
+        <w:pStyle w:val="Kop2"/>
+      </w:pPr>
     </w:p>
     <w:sectPr>
       <w:pgSz w:w="11906" w:h="16838"/>
@@ -1076,7 +3238,1376 @@
 </file>
 
 <file path=word/numbering.xml><?xml version="1.0" encoding="utf-8"?>
-<w:numbering xmlns:wpc="http://schemas.microsoft.com/office/word/2010/wordprocessingCanvas" xmlns:cx="http://schemas.microsoft.com/office/drawing/2014/chartex" xmlns:cx1="http://schemas.microsoft.com/office/drawing/2015/9/8/chartex" xmlns:cx2="http://schemas.microsoft.com/office/drawing/2015/10/21/chartex" xmlns:cx3="http://schemas.microsoft.com/office/drawing/2016/5/9/chartex" xmlns:cx4="http://schemas.microsoft.com/office/drawing/2016/5/10/chartex" xmlns:cx5="http://schemas.microsoft.com/office/drawing/2016/5/11/chartex" xmlns:cx6="http://schemas.microsoft.com/office/drawing/2016/5/12/chartex" xmlns:cx7="http://schemas.microsoft.com/office/drawing/2016/5/13/chartex" xmlns:cx8="http://schemas.microsoft.com/office/drawing/2016/5/14/chartex" xmlns:mc="http://schemas.openxmlformats.org/markup-compatibility/2006" xmlns:aink="http://schemas.microsoft.com/office/drawing/2016/ink" xmlns:am3d="http://schemas.microsoft.com/office/drawing/2017/model3d" xmlns:o="urn:schemas-microsoft-com:office:office" xmlns:oel="http://schemas.microsoft.com/office/2019/extlst" xmlns:r="http://schemas.openxmlformats.org/officeDocument/2006/relationships" xmlns:m="http://schemas.openxmlformats.org/officeDocument/2006/math" xmlns:v="urn:schemas-microsoft-com:vml" xmlns:wp14="http://schemas.microsoft.com/office/word/2010/wordprocessingDrawing" xmlns:wp="http://schemas.openxmlformats.org/drawingml/2006/wordprocessingDrawing" xmlns:w10="urn:schemas-microsoft-com:office:word" xmlns:w="http://schemas.openxmlformats.org/wordprocessingml/2006/main" xmlns:w14="http://schemas.microsoft.com/office/word/2010/wordml" xmlns:w15="http://schemas.microsoft.com/office/word/2012/wordml" xmlns:w16cex="http://schemas.microsoft.com/office/word/2018/wordml/cex" xmlns:w16cid="http://schemas.microsoft.com/office/word/2016/wordml/cid" xmlns:w16="http://schemas.microsoft.com/office/word/2018/wordml" xmlns:w16du="http://schemas.microsoft.com/office/word/2023/wordml/word16du" xmlns:w16sdtdh="http://schemas.microsoft.com/office/word/2020/wordml/sdtdatahash" xmlns:w16sdtfl="http://schemas.microsoft.com/office/word/2024/wordml/sdtformatlock" xmlns:w16se="http://schemas.microsoft.com/office/word/2015/wordml/symex" xmlns:wpg="http://schemas.microsoft.com/office/word/2010/wordprocessingGroup" xmlns:wpi="http://schemas.microsoft.com/office/word/2010/wordprocessingInk" xmlns:wne="http://schemas.microsoft.com/office/word/2006/wordml" xmlns:wps="http://schemas.microsoft.com/office/word/2010/wordprocessingShape" mc:Ignorable="w14 w15 w16se w16cid w16 w16cex w16sdtdh w16sdtfl w16du wp14"/>
+<w:numbering xmlns:wpc="http://schemas.microsoft.com/office/word/2010/wordprocessingCanvas" xmlns:cx="http://schemas.microsoft.com/office/drawing/2014/chartex" xmlns:cx1="http://schemas.microsoft.com/office/drawing/2015/9/8/chartex" xmlns:cx2="http://schemas.microsoft.com/office/drawing/2015/10/21/chartex" xmlns:cx3="http://schemas.microsoft.com/office/drawing/2016/5/9/chartex" xmlns:cx4="http://schemas.microsoft.com/office/drawing/2016/5/10/chartex" xmlns:cx5="http://schemas.microsoft.com/office/drawing/2016/5/11/chartex" xmlns:cx6="http://schemas.microsoft.com/office/drawing/2016/5/12/chartex" xmlns:cx7="http://schemas.microsoft.com/office/drawing/2016/5/13/chartex" xmlns:cx8="http://schemas.microsoft.com/office/drawing/2016/5/14/chartex" xmlns:mc="http://schemas.openxmlformats.org/markup-compatibility/2006" xmlns:aink="http://schemas.microsoft.com/office/drawing/2016/ink" xmlns:am3d="http://schemas.microsoft.com/office/drawing/2017/model3d" xmlns:o="urn:schemas-microsoft-com:office:office" xmlns:oel="http://schemas.microsoft.com/office/2019/extlst" xmlns:r="http://schemas.openxmlformats.org/officeDocument/2006/relationships" xmlns:m="http://schemas.openxmlformats.org/officeDocument/2006/math" xmlns:v="urn:schemas-microsoft-com:vml" xmlns:wp14="http://schemas.microsoft.com/office/word/2010/wordprocessingDrawing" xmlns:wp="http://schemas.openxmlformats.org/drawingml/2006/wordprocessingDrawing" xmlns:w10="urn:schemas-microsoft-com:office:word" xmlns:w="http://schemas.openxmlformats.org/wordprocessingml/2006/main" xmlns:w14="http://schemas.microsoft.com/office/word/2010/wordml" xmlns:w15="http://schemas.microsoft.com/office/word/2012/wordml" xmlns:w16cex="http://schemas.microsoft.com/office/word/2018/wordml/cex" xmlns:w16cid="http://schemas.microsoft.com/office/word/2016/wordml/cid" xmlns:w16="http://schemas.microsoft.com/office/word/2018/wordml" xmlns:w16du="http://schemas.microsoft.com/office/word/2023/wordml/word16du" xmlns:w16sdtdh="http://schemas.microsoft.com/office/word/2020/wordml/sdtdatahash" xmlns:w16sdtfl="http://schemas.microsoft.com/office/word/2024/wordml/sdtformatlock" xmlns:w16se="http://schemas.microsoft.com/office/word/2015/wordml/symex" xmlns:wpg="http://schemas.microsoft.com/office/word/2010/wordprocessingGroup" xmlns:wpi="http://schemas.microsoft.com/office/word/2010/wordprocessingInk" xmlns:wne="http://schemas.microsoft.com/office/word/2006/wordml" xmlns:wps="http://schemas.microsoft.com/office/word/2010/wordprocessingShape" mc:Ignorable="w14 w15 w16se w16cid w16 w16cex w16sdtdh w16sdtfl w16du wp14">
+  <w:abstractNum w:abstractNumId="0" w15:restartNumberingAfterBreak="0">
+    <w:nsid w:val="21062631"/>
+    <w:multiLevelType w:val="multilevel"/>
+    <w:tmpl w:val="A96073FC"/>
+    <w:lvl w:ilvl="0">
+      <w:start w:val="1"/>
+      <w:numFmt w:val="bullet"/>
+      <w:lvlText w:val=""/>
+      <w:lvlJc w:val="left"/>
+      <w:pPr>
+        <w:tabs>
+          <w:tab w:val="num" w:pos="720"/>
+        </w:tabs>
+        <w:ind w:left="720" w:hanging="360"/>
+      </w:pPr>
+      <w:rPr>
+        <w:rFonts w:ascii="Symbol" w:hAnsi="Symbol" w:hint="default"/>
+        <w:sz w:val="20"/>
+      </w:rPr>
+    </w:lvl>
+    <w:lvl w:ilvl="1" w:tentative="1">
+      <w:start w:val="1"/>
+      <w:numFmt w:val="bullet"/>
+      <w:lvlText w:val="o"/>
+      <w:lvlJc w:val="left"/>
+      <w:pPr>
+        <w:tabs>
+          <w:tab w:val="num" w:pos="1440"/>
+        </w:tabs>
+        <w:ind w:left="1440" w:hanging="360"/>
+      </w:pPr>
+      <w:rPr>
+        <w:rFonts w:ascii="Courier New" w:hAnsi="Courier New" w:hint="default"/>
+        <w:sz w:val="20"/>
+      </w:rPr>
+    </w:lvl>
+    <w:lvl w:ilvl="2" w:tentative="1">
+      <w:start w:val="1"/>
+      <w:numFmt w:val="bullet"/>
+      <w:lvlText w:val=""/>
+      <w:lvlJc w:val="left"/>
+      <w:pPr>
+        <w:tabs>
+          <w:tab w:val="num" w:pos="2160"/>
+        </w:tabs>
+        <w:ind w:left="2160" w:hanging="360"/>
+      </w:pPr>
+      <w:rPr>
+        <w:rFonts w:ascii="Wingdings" w:hAnsi="Wingdings" w:hint="default"/>
+        <w:sz w:val="20"/>
+      </w:rPr>
+    </w:lvl>
+    <w:lvl w:ilvl="3" w:tentative="1">
+      <w:start w:val="1"/>
+      <w:numFmt w:val="bullet"/>
+      <w:lvlText w:val=""/>
+      <w:lvlJc w:val="left"/>
+      <w:pPr>
+        <w:tabs>
+          <w:tab w:val="num" w:pos="2880"/>
+        </w:tabs>
+        <w:ind w:left="2880" w:hanging="360"/>
+      </w:pPr>
+      <w:rPr>
+        <w:rFonts w:ascii="Wingdings" w:hAnsi="Wingdings" w:hint="default"/>
+        <w:sz w:val="20"/>
+      </w:rPr>
+    </w:lvl>
+    <w:lvl w:ilvl="4" w:tentative="1">
+      <w:start w:val="1"/>
+      <w:numFmt w:val="bullet"/>
+      <w:lvlText w:val=""/>
+      <w:lvlJc w:val="left"/>
+      <w:pPr>
+        <w:tabs>
+          <w:tab w:val="num" w:pos="3600"/>
+        </w:tabs>
+        <w:ind w:left="3600" w:hanging="360"/>
+      </w:pPr>
+      <w:rPr>
+        <w:rFonts w:ascii="Wingdings" w:hAnsi="Wingdings" w:hint="default"/>
+        <w:sz w:val="20"/>
+      </w:rPr>
+    </w:lvl>
+    <w:lvl w:ilvl="5" w:tentative="1">
+      <w:start w:val="1"/>
+      <w:numFmt w:val="bullet"/>
+      <w:lvlText w:val=""/>
+      <w:lvlJc w:val="left"/>
+      <w:pPr>
+        <w:tabs>
+          <w:tab w:val="num" w:pos="4320"/>
+        </w:tabs>
+        <w:ind w:left="4320" w:hanging="360"/>
+      </w:pPr>
+      <w:rPr>
+        <w:rFonts w:ascii="Wingdings" w:hAnsi="Wingdings" w:hint="default"/>
+        <w:sz w:val="20"/>
+      </w:rPr>
+    </w:lvl>
+    <w:lvl w:ilvl="6" w:tentative="1">
+      <w:start w:val="1"/>
+      <w:numFmt w:val="bullet"/>
+      <w:lvlText w:val=""/>
+      <w:lvlJc w:val="left"/>
+      <w:pPr>
+        <w:tabs>
+          <w:tab w:val="num" w:pos="5040"/>
+        </w:tabs>
+        <w:ind w:left="5040" w:hanging="360"/>
+      </w:pPr>
+      <w:rPr>
+        <w:rFonts w:ascii="Wingdings" w:hAnsi="Wingdings" w:hint="default"/>
+        <w:sz w:val="20"/>
+      </w:rPr>
+    </w:lvl>
+    <w:lvl w:ilvl="7" w:tentative="1">
+      <w:start w:val="1"/>
+      <w:numFmt w:val="bullet"/>
+      <w:lvlText w:val=""/>
+      <w:lvlJc w:val="left"/>
+      <w:pPr>
+        <w:tabs>
+          <w:tab w:val="num" w:pos="5760"/>
+        </w:tabs>
+        <w:ind w:left="5760" w:hanging="360"/>
+      </w:pPr>
+      <w:rPr>
+        <w:rFonts w:ascii="Wingdings" w:hAnsi="Wingdings" w:hint="default"/>
+        <w:sz w:val="20"/>
+      </w:rPr>
+    </w:lvl>
+    <w:lvl w:ilvl="8" w:tentative="1">
+      <w:start w:val="1"/>
+      <w:numFmt w:val="bullet"/>
+      <w:lvlText w:val=""/>
+      <w:lvlJc w:val="left"/>
+      <w:pPr>
+        <w:tabs>
+          <w:tab w:val="num" w:pos="6480"/>
+        </w:tabs>
+        <w:ind w:left="6480" w:hanging="360"/>
+      </w:pPr>
+      <w:rPr>
+        <w:rFonts w:ascii="Wingdings" w:hAnsi="Wingdings" w:hint="default"/>
+        <w:sz w:val="20"/>
+      </w:rPr>
+    </w:lvl>
+  </w:abstractNum>
+  <w:abstractNum w:abstractNumId="1" w15:restartNumberingAfterBreak="0">
+    <w:nsid w:val="2E164E91"/>
+    <w:multiLevelType w:val="multilevel"/>
+    <w:tmpl w:val="BA3E705C"/>
+    <w:lvl w:ilvl="0">
+      <w:start w:val="1"/>
+      <w:numFmt w:val="bullet"/>
+      <w:lvlText w:val=""/>
+      <w:lvlJc w:val="left"/>
+      <w:pPr>
+        <w:tabs>
+          <w:tab w:val="num" w:pos="720"/>
+        </w:tabs>
+        <w:ind w:left="720" w:hanging="360"/>
+      </w:pPr>
+      <w:rPr>
+        <w:rFonts w:ascii="Symbol" w:hAnsi="Symbol" w:hint="default"/>
+        <w:sz w:val="20"/>
+      </w:rPr>
+    </w:lvl>
+    <w:lvl w:ilvl="1" w:tentative="1">
+      <w:start w:val="1"/>
+      <w:numFmt w:val="bullet"/>
+      <w:lvlText w:val="o"/>
+      <w:lvlJc w:val="left"/>
+      <w:pPr>
+        <w:tabs>
+          <w:tab w:val="num" w:pos="1440"/>
+        </w:tabs>
+        <w:ind w:left="1440" w:hanging="360"/>
+      </w:pPr>
+      <w:rPr>
+        <w:rFonts w:ascii="Courier New" w:hAnsi="Courier New" w:hint="default"/>
+        <w:sz w:val="20"/>
+      </w:rPr>
+    </w:lvl>
+    <w:lvl w:ilvl="2" w:tentative="1">
+      <w:start w:val="1"/>
+      <w:numFmt w:val="bullet"/>
+      <w:lvlText w:val=""/>
+      <w:lvlJc w:val="left"/>
+      <w:pPr>
+        <w:tabs>
+          <w:tab w:val="num" w:pos="2160"/>
+        </w:tabs>
+        <w:ind w:left="2160" w:hanging="360"/>
+      </w:pPr>
+      <w:rPr>
+        <w:rFonts w:ascii="Wingdings" w:hAnsi="Wingdings" w:hint="default"/>
+        <w:sz w:val="20"/>
+      </w:rPr>
+    </w:lvl>
+    <w:lvl w:ilvl="3" w:tentative="1">
+      <w:start w:val="1"/>
+      <w:numFmt w:val="bullet"/>
+      <w:lvlText w:val=""/>
+      <w:lvlJc w:val="left"/>
+      <w:pPr>
+        <w:tabs>
+          <w:tab w:val="num" w:pos="2880"/>
+        </w:tabs>
+        <w:ind w:left="2880" w:hanging="360"/>
+      </w:pPr>
+      <w:rPr>
+        <w:rFonts w:ascii="Wingdings" w:hAnsi="Wingdings" w:hint="default"/>
+        <w:sz w:val="20"/>
+      </w:rPr>
+    </w:lvl>
+    <w:lvl w:ilvl="4" w:tentative="1">
+      <w:start w:val="1"/>
+      <w:numFmt w:val="bullet"/>
+      <w:lvlText w:val=""/>
+      <w:lvlJc w:val="left"/>
+      <w:pPr>
+        <w:tabs>
+          <w:tab w:val="num" w:pos="3600"/>
+        </w:tabs>
+        <w:ind w:left="3600" w:hanging="360"/>
+      </w:pPr>
+      <w:rPr>
+        <w:rFonts w:ascii="Wingdings" w:hAnsi="Wingdings" w:hint="default"/>
+        <w:sz w:val="20"/>
+      </w:rPr>
+    </w:lvl>
+    <w:lvl w:ilvl="5" w:tentative="1">
+      <w:start w:val="1"/>
+      <w:numFmt w:val="bullet"/>
+      <w:lvlText w:val=""/>
+      <w:lvlJc w:val="left"/>
+      <w:pPr>
+        <w:tabs>
+          <w:tab w:val="num" w:pos="4320"/>
+        </w:tabs>
+        <w:ind w:left="4320" w:hanging="360"/>
+      </w:pPr>
+      <w:rPr>
+        <w:rFonts w:ascii="Wingdings" w:hAnsi="Wingdings" w:hint="default"/>
+        <w:sz w:val="20"/>
+      </w:rPr>
+    </w:lvl>
+    <w:lvl w:ilvl="6" w:tentative="1">
+      <w:start w:val="1"/>
+      <w:numFmt w:val="bullet"/>
+      <w:lvlText w:val=""/>
+      <w:lvlJc w:val="left"/>
+      <w:pPr>
+        <w:tabs>
+          <w:tab w:val="num" w:pos="5040"/>
+        </w:tabs>
+        <w:ind w:left="5040" w:hanging="360"/>
+      </w:pPr>
+      <w:rPr>
+        <w:rFonts w:ascii="Wingdings" w:hAnsi="Wingdings" w:hint="default"/>
+        <w:sz w:val="20"/>
+      </w:rPr>
+    </w:lvl>
+    <w:lvl w:ilvl="7" w:tentative="1">
+      <w:start w:val="1"/>
+      <w:numFmt w:val="bullet"/>
+      <w:lvlText w:val=""/>
+      <w:lvlJc w:val="left"/>
+      <w:pPr>
+        <w:tabs>
+          <w:tab w:val="num" w:pos="5760"/>
+        </w:tabs>
+        <w:ind w:left="5760" w:hanging="360"/>
+      </w:pPr>
+      <w:rPr>
+        <w:rFonts w:ascii="Wingdings" w:hAnsi="Wingdings" w:hint="default"/>
+        <w:sz w:val="20"/>
+      </w:rPr>
+    </w:lvl>
+    <w:lvl w:ilvl="8" w:tentative="1">
+      <w:start w:val="1"/>
+      <w:numFmt w:val="bullet"/>
+      <w:lvlText w:val=""/>
+      <w:lvlJc w:val="left"/>
+      <w:pPr>
+        <w:tabs>
+          <w:tab w:val="num" w:pos="6480"/>
+        </w:tabs>
+        <w:ind w:left="6480" w:hanging="360"/>
+      </w:pPr>
+      <w:rPr>
+        <w:rFonts w:ascii="Wingdings" w:hAnsi="Wingdings" w:hint="default"/>
+        <w:sz w:val="20"/>
+      </w:rPr>
+    </w:lvl>
+  </w:abstractNum>
+  <w:abstractNum w:abstractNumId="2" w15:restartNumberingAfterBreak="0">
+    <w:nsid w:val="34EF64EA"/>
+    <w:multiLevelType w:val="multilevel"/>
+    <w:tmpl w:val="3F2C0D06"/>
+    <w:lvl w:ilvl="0">
+      <w:start w:val="1"/>
+      <w:numFmt w:val="bullet"/>
+      <w:lvlText w:val=""/>
+      <w:lvlJc w:val="left"/>
+      <w:pPr>
+        <w:tabs>
+          <w:tab w:val="num" w:pos="720"/>
+        </w:tabs>
+        <w:ind w:left="720" w:hanging="360"/>
+      </w:pPr>
+      <w:rPr>
+        <w:rFonts w:ascii="Symbol" w:hAnsi="Symbol" w:hint="default"/>
+        <w:sz w:val="20"/>
+      </w:rPr>
+    </w:lvl>
+    <w:lvl w:ilvl="1" w:tentative="1">
+      <w:start w:val="1"/>
+      <w:numFmt w:val="bullet"/>
+      <w:lvlText w:val="o"/>
+      <w:lvlJc w:val="left"/>
+      <w:pPr>
+        <w:tabs>
+          <w:tab w:val="num" w:pos="1440"/>
+        </w:tabs>
+        <w:ind w:left="1440" w:hanging="360"/>
+      </w:pPr>
+      <w:rPr>
+        <w:rFonts w:ascii="Courier New" w:hAnsi="Courier New" w:hint="default"/>
+        <w:sz w:val="20"/>
+      </w:rPr>
+    </w:lvl>
+    <w:lvl w:ilvl="2" w:tentative="1">
+      <w:start w:val="1"/>
+      <w:numFmt w:val="bullet"/>
+      <w:lvlText w:val=""/>
+      <w:lvlJc w:val="left"/>
+      <w:pPr>
+        <w:tabs>
+          <w:tab w:val="num" w:pos="2160"/>
+        </w:tabs>
+        <w:ind w:left="2160" w:hanging="360"/>
+      </w:pPr>
+      <w:rPr>
+        <w:rFonts w:ascii="Wingdings" w:hAnsi="Wingdings" w:hint="default"/>
+        <w:sz w:val="20"/>
+      </w:rPr>
+    </w:lvl>
+    <w:lvl w:ilvl="3" w:tentative="1">
+      <w:start w:val="1"/>
+      <w:numFmt w:val="bullet"/>
+      <w:lvlText w:val=""/>
+      <w:lvlJc w:val="left"/>
+      <w:pPr>
+        <w:tabs>
+          <w:tab w:val="num" w:pos="2880"/>
+        </w:tabs>
+        <w:ind w:left="2880" w:hanging="360"/>
+      </w:pPr>
+      <w:rPr>
+        <w:rFonts w:ascii="Wingdings" w:hAnsi="Wingdings" w:hint="default"/>
+        <w:sz w:val="20"/>
+      </w:rPr>
+    </w:lvl>
+    <w:lvl w:ilvl="4" w:tentative="1">
+      <w:start w:val="1"/>
+      <w:numFmt w:val="bullet"/>
+      <w:lvlText w:val=""/>
+      <w:lvlJc w:val="left"/>
+      <w:pPr>
+        <w:tabs>
+          <w:tab w:val="num" w:pos="3600"/>
+        </w:tabs>
+        <w:ind w:left="3600" w:hanging="360"/>
+      </w:pPr>
+      <w:rPr>
+        <w:rFonts w:ascii="Wingdings" w:hAnsi="Wingdings" w:hint="default"/>
+        <w:sz w:val="20"/>
+      </w:rPr>
+    </w:lvl>
+    <w:lvl w:ilvl="5" w:tentative="1">
+      <w:start w:val="1"/>
+      <w:numFmt w:val="bullet"/>
+      <w:lvlText w:val=""/>
+      <w:lvlJc w:val="left"/>
+      <w:pPr>
+        <w:tabs>
+          <w:tab w:val="num" w:pos="4320"/>
+        </w:tabs>
+        <w:ind w:left="4320" w:hanging="360"/>
+      </w:pPr>
+      <w:rPr>
+        <w:rFonts w:ascii="Wingdings" w:hAnsi="Wingdings" w:hint="default"/>
+        <w:sz w:val="20"/>
+      </w:rPr>
+    </w:lvl>
+    <w:lvl w:ilvl="6" w:tentative="1">
+      <w:start w:val="1"/>
+      <w:numFmt w:val="bullet"/>
+      <w:lvlText w:val=""/>
+      <w:lvlJc w:val="left"/>
+      <w:pPr>
+        <w:tabs>
+          <w:tab w:val="num" w:pos="5040"/>
+        </w:tabs>
+        <w:ind w:left="5040" w:hanging="360"/>
+      </w:pPr>
+      <w:rPr>
+        <w:rFonts w:ascii="Wingdings" w:hAnsi="Wingdings" w:hint="default"/>
+        <w:sz w:val="20"/>
+      </w:rPr>
+    </w:lvl>
+    <w:lvl w:ilvl="7" w:tentative="1">
+      <w:start w:val="1"/>
+      <w:numFmt w:val="bullet"/>
+      <w:lvlText w:val=""/>
+      <w:lvlJc w:val="left"/>
+      <w:pPr>
+        <w:tabs>
+          <w:tab w:val="num" w:pos="5760"/>
+        </w:tabs>
+        <w:ind w:left="5760" w:hanging="360"/>
+      </w:pPr>
+      <w:rPr>
+        <w:rFonts w:ascii="Wingdings" w:hAnsi="Wingdings" w:hint="default"/>
+        <w:sz w:val="20"/>
+      </w:rPr>
+    </w:lvl>
+    <w:lvl w:ilvl="8" w:tentative="1">
+      <w:start w:val="1"/>
+      <w:numFmt w:val="bullet"/>
+      <w:lvlText w:val=""/>
+      <w:lvlJc w:val="left"/>
+      <w:pPr>
+        <w:tabs>
+          <w:tab w:val="num" w:pos="6480"/>
+        </w:tabs>
+        <w:ind w:left="6480" w:hanging="360"/>
+      </w:pPr>
+      <w:rPr>
+        <w:rFonts w:ascii="Wingdings" w:hAnsi="Wingdings" w:hint="default"/>
+        <w:sz w:val="20"/>
+      </w:rPr>
+    </w:lvl>
+  </w:abstractNum>
+  <w:abstractNum w:abstractNumId="3" w15:restartNumberingAfterBreak="0">
+    <w:nsid w:val="4AA30539"/>
+    <w:multiLevelType w:val="multilevel"/>
+    <w:tmpl w:val="19D0952A"/>
+    <w:lvl w:ilvl="0">
+      <w:start w:val="1"/>
+      <w:numFmt w:val="bullet"/>
+      <w:lvlText w:val=""/>
+      <w:lvlJc w:val="left"/>
+      <w:pPr>
+        <w:tabs>
+          <w:tab w:val="num" w:pos="720"/>
+        </w:tabs>
+        <w:ind w:left="720" w:hanging="360"/>
+      </w:pPr>
+      <w:rPr>
+        <w:rFonts w:ascii="Symbol" w:hAnsi="Symbol" w:hint="default"/>
+        <w:sz w:val="20"/>
+      </w:rPr>
+    </w:lvl>
+    <w:lvl w:ilvl="1" w:tentative="1">
+      <w:start w:val="1"/>
+      <w:numFmt w:val="bullet"/>
+      <w:lvlText w:val="o"/>
+      <w:lvlJc w:val="left"/>
+      <w:pPr>
+        <w:tabs>
+          <w:tab w:val="num" w:pos="1440"/>
+        </w:tabs>
+        <w:ind w:left="1440" w:hanging="360"/>
+      </w:pPr>
+      <w:rPr>
+        <w:rFonts w:ascii="Courier New" w:hAnsi="Courier New" w:hint="default"/>
+        <w:sz w:val="20"/>
+      </w:rPr>
+    </w:lvl>
+    <w:lvl w:ilvl="2" w:tentative="1">
+      <w:start w:val="1"/>
+      <w:numFmt w:val="bullet"/>
+      <w:lvlText w:val=""/>
+      <w:lvlJc w:val="left"/>
+      <w:pPr>
+        <w:tabs>
+          <w:tab w:val="num" w:pos="2160"/>
+        </w:tabs>
+        <w:ind w:left="2160" w:hanging="360"/>
+      </w:pPr>
+      <w:rPr>
+        <w:rFonts w:ascii="Wingdings" w:hAnsi="Wingdings" w:hint="default"/>
+        <w:sz w:val="20"/>
+      </w:rPr>
+    </w:lvl>
+    <w:lvl w:ilvl="3" w:tentative="1">
+      <w:start w:val="1"/>
+      <w:numFmt w:val="bullet"/>
+      <w:lvlText w:val=""/>
+      <w:lvlJc w:val="left"/>
+      <w:pPr>
+        <w:tabs>
+          <w:tab w:val="num" w:pos="2880"/>
+        </w:tabs>
+        <w:ind w:left="2880" w:hanging="360"/>
+      </w:pPr>
+      <w:rPr>
+        <w:rFonts w:ascii="Wingdings" w:hAnsi="Wingdings" w:hint="default"/>
+        <w:sz w:val="20"/>
+      </w:rPr>
+    </w:lvl>
+    <w:lvl w:ilvl="4" w:tentative="1">
+      <w:start w:val="1"/>
+      <w:numFmt w:val="bullet"/>
+      <w:lvlText w:val=""/>
+      <w:lvlJc w:val="left"/>
+      <w:pPr>
+        <w:tabs>
+          <w:tab w:val="num" w:pos="3600"/>
+        </w:tabs>
+        <w:ind w:left="3600" w:hanging="360"/>
+      </w:pPr>
+      <w:rPr>
+        <w:rFonts w:ascii="Wingdings" w:hAnsi="Wingdings" w:hint="default"/>
+        <w:sz w:val="20"/>
+      </w:rPr>
+    </w:lvl>
+    <w:lvl w:ilvl="5" w:tentative="1">
+      <w:start w:val="1"/>
+      <w:numFmt w:val="bullet"/>
+      <w:lvlText w:val=""/>
+      <w:lvlJc w:val="left"/>
+      <w:pPr>
+        <w:tabs>
+          <w:tab w:val="num" w:pos="4320"/>
+        </w:tabs>
+        <w:ind w:left="4320" w:hanging="360"/>
+      </w:pPr>
+      <w:rPr>
+        <w:rFonts w:ascii="Wingdings" w:hAnsi="Wingdings" w:hint="default"/>
+        <w:sz w:val="20"/>
+      </w:rPr>
+    </w:lvl>
+    <w:lvl w:ilvl="6" w:tentative="1">
+      <w:start w:val="1"/>
+      <w:numFmt w:val="bullet"/>
+      <w:lvlText w:val=""/>
+      <w:lvlJc w:val="left"/>
+      <w:pPr>
+        <w:tabs>
+          <w:tab w:val="num" w:pos="5040"/>
+        </w:tabs>
+        <w:ind w:left="5040" w:hanging="360"/>
+      </w:pPr>
+      <w:rPr>
+        <w:rFonts w:ascii="Wingdings" w:hAnsi="Wingdings" w:hint="default"/>
+        <w:sz w:val="20"/>
+      </w:rPr>
+    </w:lvl>
+    <w:lvl w:ilvl="7" w:tentative="1">
+      <w:start w:val="1"/>
+      <w:numFmt w:val="bullet"/>
+      <w:lvlText w:val=""/>
+      <w:lvlJc w:val="left"/>
+      <w:pPr>
+        <w:tabs>
+          <w:tab w:val="num" w:pos="5760"/>
+        </w:tabs>
+        <w:ind w:left="5760" w:hanging="360"/>
+      </w:pPr>
+      <w:rPr>
+        <w:rFonts w:ascii="Wingdings" w:hAnsi="Wingdings" w:hint="default"/>
+        <w:sz w:val="20"/>
+      </w:rPr>
+    </w:lvl>
+    <w:lvl w:ilvl="8" w:tentative="1">
+      <w:start w:val="1"/>
+      <w:numFmt w:val="bullet"/>
+      <w:lvlText w:val=""/>
+      <w:lvlJc w:val="left"/>
+      <w:pPr>
+        <w:tabs>
+          <w:tab w:val="num" w:pos="6480"/>
+        </w:tabs>
+        <w:ind w:left="6480" w:hanging="360"/>
+      </w:pPr>
+      <w:rPr>
+        <w:rFonts w:ascii="Wingdings" w:hAnsi="Wingdings" w:hint="default"/>
+        <w:sz w:val="20"/>
+      </w:rPr>
+    </w:lvl>
+  </w:abstractNum>
+  <w:abstractNum w:abstractNumId="4" w15:restartNumberingAfterBreak="0">
+    <w:nsid w:val="5E854D98"/>
+    <w:multiLevelType w:val="multilevel"/>
+    <w:tmpl w:val="E86E75DC"/>
+    <w:lvl w:ilvl="0">
+      <w:start w:val="1"/>
+      <w:numFmt w:val="bullet"/>
+      <w:lvlText w:val=""/>
+      <w:lvlJc w:val="left"/>
+      <w:pPr>
+        <w:tabs>
+          <w:tab w:val="num" w:pos="720"/>
+        </w:tabs>
+        <w:ind w:left="720" w:hanging="360"/>
+      </w:pPr>
+      <w:rPr>
+        <w:rFonts w:ascii="Symbol" w:hAnsi="Symbol" w:hint="default"/>
+        <w:sz w:val="20"/>
+      </w:rPr>
+    </w:lvl>
+    <w:lvl w:ilvl="1" w:tentative="1">
+      <w:start w:val="1"/>
+      <w:numFmt w:val="bullet"/>
+      <w:lvlText w:val="o"/>
+      <w:lvlJc w:val="left"/>
+      <w:pPr>
+        <w:tabs>
+          <w:tab w:val="num" w:pos="1440"/>
+        </w:tabs>
+        <w:ind w:left="1440" w:hanging="360"/>
+      </w:pPr>
+      <w:rPr>
+        <w:rFonts w:ascii="Courier New" w:hAnsi="Courier New" w:hint="default"/>
+        <w:sz w:val="20"/>
+      </w:rPr>
+    </w:lvl>
+    <w:lvl w:ilvl="2" w:tentative="1">
+      <w:start w:val="1"/>
+      <w:numFmt w:val="bullet"/>
+      <w:lvlText w:val=""/>
+      <w:lvlJc w:val="left"/>
+      <w:pPr>
+        <w:tabs>
+          <w:tab w:val="num" w:pos="2160"/>
+        </w:tabs>
+        <w:ind w:left="2160" w:hanging="360"/>
+      </w:pPr>
+      <w:rPr>
+        <w:rFonts w:ascii="Wingdings" w:hAnsi="Wingdings" w:hint="default"/>
+        <w:sz w:val="20"/>
+      </w:rPr>
+    </w:lvl>
+    <w:lvl w:ilvl="3" w:tentative="1">
+      <w:start w:val="1"/>
+      <w:numFmt w:val="bullet"/>
+      <w:lvlText w:val=""/>
+      <w:lvlJc w:val="left"/>
+      <w:pPr>
+        <w:tabs>
+          <w:tab w:val="num" w:pos="2880"/>
+        </w:tabs>
+        <w:ind w:left="2880" w:hanging="360"/>
+      </w:pPr>
+      <w:rPr>
+        <w:rFonts w:ascii="Wingdings" w:hAnsi="Wingdings" w:hint="default"/>
+        <w:sz w:val="20"/>
+      </w:rPr>
+    </w:lvl>
+    <w:lvl w:ilvl="4" w:tentative="1">
+      <w:start w:val="1"/>
+      <w:numFmt w:val="bullet"/>
+      <w:lvlText w:val=""/>
+      <w:lvlJc w:val="left"/>
+      <w:pPr>
+        <w:tabs>
+          <w:tab w:val="num" w:pos="3600"/>
+        </w:tabs>
+        <w:ind w:left="3600" w:hanging="360"/>
+      </w:pPr>
+      <w:rPr>
+        <w:rFonts w:ascii="Wingdings" w:hAnsi="Wingdings" w:hint="default"/>
+        <w:sz w:val="20"/>
+      </w:rPr>
+    </w:lvl>
+    <w:lvl w:ilvl="5" w:tentative="1">
+      <w:start w:val="1"/>
+      <w:numFmt w:val="bullet"/>
+      <w:lvlText w:val=""/>
+      <w:lvlJc w:val="left"/>
+      <w:pPr>
+        <w:tabs>
+          <w:tab w:val="num" w:pos="4320"/>
+        </w:tabs>
+        <w:ind w:left="4320" w:hanging="360"/>
+      </w:pPr>
+      <w:rPr>
+        <w:rFonts w:ascii="Wingdings" w:hAnsi="Wingdings" w:hint="default"/>
+        <w:sz w:val="20"/>
+      </w:rPr>
+    </w:lvl>
+    <w:lvl w:ilvl="6" w:tentative="1">
+      <w:start w:val="1"/>
+      <w:numFmt w:val="bullet"/>
+      <w:lvlText w:val=""/>
+      <w:lvlJc w:val="left"/>
+      <w:pPr>
+        <w:tabs>
+          <w:tab w:val="num" w:pos="5040"/>
+        </w:tabs>
+        <w:ind w:left="5040" w:hanging="360"/>
+      </w:pPr>
+      <w:rPr>
+        <w:rFonts w:ascii="Wingdings" w:hAnsi="Wingdings" w:hint="default"/>
+        <w:sz w:val="20"/>
+      </w:rPr>
+    </w:lvl>
+    <w:lvl w:ilvl="7" w:tentative="1">
+      <w:start w:val="1"/>
+      <w:numFmt w:val="bullet"/>
+      <w:lvlText w:val=""/>
+      <w:lvlJc w:val="left"/>
+      <w:pPr>
+        <w:tabs>
+          <w:tab w:val="num" w:pos="5760"/>
+        </w:tabs>
+        <w:ind w:left="5760" w:hanging="360"/>
+      </w:pPr>
+      <w:rPr>
+        <w:rFonts w:ascii="Wingdings" w:hAnsi="Wingdings" w:hint="default"/>
+        <w:sz w:val="20"/>
+      </w:rPr>
+    </w:lvl>
+    <w:lvl w:ilvl="8" w:tentative="1">
+      <w:start w:val="1"/>
+      <w:numFmt w:val="bullet"/>
+      <w:lvlText w:val=""/>
+      <w:lvlJc w:val="left"/>
+      <w:pPr>
+        <w:tabs>
+          <w:tab w:val="num" w:pos="6480"/>
+        </w:tabs>
+        <w:ind w:left="6480" w:hanging="360"/>
+      </w:pPr>
+      <w:rPr>
+        <w:rFonts w:ascii="Wingdings" w:hAnsi="Wingdings" w:hint="default"/>
+        <w:sz w:val="20"/>
+      </w:rPr>
+    </w:lvl>
+  </w:abstractNum>
+  <w:abstractNum w:abstractNumId="5" w15:restartNumberingAfterBreak="0">
+    <w:nsid w:val="63B44238"/>
+    <w:multiLevelType w:val="multilevel"/>
+    <w:tmpl w:val="6362123A"/>
+    <w:lvl w:ilvl="0">
+      <w:start w:val="1"/>
+      <w:numFmt w:val="bullet"/>
+      <w:lvlText w:val=""/>
+      <w:lvlJc w:val="left"/>
+      <w:pPr>
+        <w:tabs>
+          <w:tab w:val="num" w:pos="720"/>
+        </w:tabs>
+        <w:ind w:left="720" w:hanging="360"/>
+      </w:pPr>
+      <w:rPr>
+        <w:rFonts w:ascii="Symbol" w:hAnsi="Symbol" w:hint="default"/>
+        <w:sz w:val="20"/>
+      </w:rPr>
+    </w:lvl>
+    <w:lvl w:ilvl="1" w:tentative="1">
+      <w:start w:val="1"/>
+      <w:numFmt w:val="bullet"/>
+      <w:lvlText w:val="o"/>
+      <w:lvlJc w:val="left"/>
+      <w:pPr>
+        <w:tabs>
+          <w:tab w:val="num" w:pos="1440"/>
+        </w:tabs>
+        <w:ind w:left="1440" w:hanging="360"/>
+      </w:pPr>
+      <w:rPr>
+        <w:rFonts w:ascii="Courier New" w:hAnsi="Courier New" w:hint="default"/>
+        <w:sz w:val="20"/>
+      </w:rPr>
+    </w:lvl>
+    <w:lvl w:ilvl="2" w:tentative="1">
+      <w:start w:val="1"/>
+      <w:numFmt w:val="bullet"/>
+      <w:lvlText w:val=""/>
+      <w:lvlJc w:val="left"/>
+      <w:pPr>
+        <w:tabs>
+          <w:tab w:val="num" w:pos="2160"/>
+        </w:tabs>
+        <w:ind w:left="2160" w:hanging="360"/>
+      </w:pPr>
+      <w:rPr>
+        <w:rFonts w:ascii="Wingdings" w:hAnsi="Wingdings" w:hint="default"/>
+        <w:sz w:val="20"/>
+      </w:rPr>
+    </w:lvl>
+    <w:lvl w:ilvl="3" w:tentative="1">
+      <w:start w:val="1"/>
+      <w:numFmt w:val="bullet"/>
+      <w:lvlText w:val=""/>
+      <w:lvlJc w:val="left"/>
+      <w:pPr>
+        <w:tabs>
+          <w:tab w:val="num" w:pos="2880"/>
+        </w:tabs>
+        <w:ind w:left="2880" w:hanging="360"/>
+      </w:pPr>
+      <w:rPr>
+        <w:rFonts w:ascii="Wingdings" w:hAnsi="Wingdings" w:hint="default"/>
+        <w:sz w:val="20"/>
+      </w:rPr>
+    </w:lvl>
+    <w:lvl w:ilvl="4" w:tentative="1">
+      <w:start w:val="1"/>
+      <w:numFmt w:val="bullet"/>
+      <w:lvlText w:val=""/>
+      <w:lvlJc w:val="left"/>
+      <w:pPr>
+        <w:tabs>
+          <w:tab w:val="num" w:pos="3600"/>
+        </w:tabs>
+        <w:ind w:left="3600" w:hanging="360"/>
+      </w:pPr>
+      <w:rPr>
+        <w:rFonts w:ascii="Wingdings" w:hAnsi="Wingdings" w:hint="default"/>
+        <w:sz w:val="20"/>
+      </w:rPr>
+    </w:lvl>
+    <w:lvl w:ilvl="5" w:tentative="1">
+      <w:start w:val="1"/>
+      <w:numFmt w:val="bullet"/>
+      <w:lvlText w:val=""/>
+      <w:lvlJc w:val="left"/>
+      <w:pPr>
+        <w:tabs>
+          <w:tab w:val="num" w:pos="4320"/>
+        </w:tabs>
+        <w:ind w:left="4320" w:hanging="360"/>
+      </w:pPr>
+      <w:rPr>
+        <w:rFonts w:ascii="Wingdings" w:hAnsi="Wingdings" w:hint="default"/>
+        <w:sz w:val="20"/>
+      </w:rPr>
+    </w:lvl>
+    <w:lvl w:ilvl="6" w:tentative="1">
+      <w:start w:val="1"/>
+      <w:numFmt w:val="bullet"/>
+      <w:lvlText w:val=""/>
+      <w:lvlJc w:val="left"/>
+      <w:pPr>
+        <w:tabs>
+          <w:tab w:val="num" w:pos="5040"/>
+        </w:tabs>
+        <w:ind w:left="5040" w:hanging="360"/>
+      </w:pPr>
+      <w:rPr>
+        <w:rFonts w:ascii="Wingdings" w:hAnsi="Wingdings" w:hint="default"/>
+        <w:sz w:val="20"/>
+      </w:rPr>
+    </w:lvl>
+    <w:lvl w:ilvl="7" w:tentative="1">
+      <w:start w:val="1"/>
+      <w:numFmt w:val="bullet"/>
+      <w:lvlText w:val=""/>
+      <w:lvlJc w:val="left"/>
+      <w:pPr>
+        <w:tabs>
+          <w:tab w:val="num" w:pos="5760"/>
+        </w:tabs>
+        <w:ind w:left="5760" w:hanging="360"/>
+      </w:pPr>
+      <w:rPr>
+        <w:rFonts w:ascii="Wingdings" w:hAnsi="Wingdings" w:hint="default"/>
+        <w:sz w:val="20"/>
+      </w:rPr>
+    </w:lvl>
+    <w:lvl w:ilvl="8" w:tentative="1">
+      <w:start w:val="1"/>
+      <w:numFmt w:val="bullet"/>
+      <w:lvlText w:val=""/>
+      <w:lvlJc w:val="left"/>
+      <w:pPr>
+        <w:tabs>
+          <w:tab w:val="num" w:pos="6480"/>
+        </w:tabs>
+        <w:ind w:left="6480" w:hanging="360"/>
+      </w:pPr>
+      <w:rPr>
+        <w:rFonts w:ascii="Wingdings" w:hAnsi="Wingdings" w:hint="default"/>
+        <w:sz w:val="20"/>
+      </w:rPr>
+    </w:lvl>
+  </w:abstractNum>
+  <w:abstractNum w:abstractNumId="6" w15:restartNumberingAfterBreak="0">
+    <w:nsid w:val="69EE1518"/>
+    <w:multiLevelType w:val="multilevel"/>
+    <w:tmpl w:val="F6FCEAFC"/>
+    <w:lvl w:ilvl="0">
+      <w:start w:val="1"/>
+      <w:numFmt w:val="bullet"/>
+      <w:lvlText w:val=""/>
+      <w:lvlJc w:val="left"/>
+      <w:pPr>
+        <w:tabs>
+          <w:tab w:val="num" w:pos="720"/>
+        </w:tabs>
+        <w:ind w:left="720" w:hanging="360"/>
+      </w:pPr>
+      <w:rPr>
+        <w:rFonts w:ascii="Symbol" w:hAnsi="Symbol" w:hint="default"/>
+        <w:sz w:val="20"/>
+      </w:rPr>
+    </w:lvl>
+    <w:lvl w:ilvl="1" w:tentative="1">
+      <w:start w:val="1"/>
+      <w:numFmt w:val="bullet"/>
+      <w:lvlText w:val="o"/>
+      <w:lvlJc w:val="left"/>
+      <w:pPr>
+        <w:tabs>
+          <w:tab w:val="num" w:pos="1440"/>
+        </w:tabs>
+        <w:ind w:left="1440" w:hanging="360"/>
+      </w:pPr>
+      <w:rPr>
+        <w:rFonts w:ascii="Courier New" w:hAnsi="Courier New" w:hint="default"/>
+        <w:sz w:val="20"/>
+      </w:rPr>
+    </w:lvl>
+    <w:lvl w:ilvl="2" w:tentative="1">
+      <w:start w:val="1"/>
+      <w:numFmt w:val="bullet"/>
+      <w:lvlText w:val=""/>
+      <w:lvlJc w:val="left"/>
+      <w:pPr>
+        <w:tabs>
+          <w:tab w:val="num" w:pos="2160"/>
+        </w:tabs>
+        <w:ind w:left="2160" w:hanging="360"/>
+      </w:pPr>
+      <w:rPr>
+        <w:rFonts w:ascii="Wingdings" w:hAnsi="Wingdings" w:hint="default"/>
+        <w:sz w:val="20"/>
+      </w:rPr>
+    </w:lvl>
+    <w:lvl w:ilvl="3" w:tentative="1">
+      <w:start w:val="1"/>
+      <w:numFmt w:val="bullet"/>
+      <w:lvlText w:val=""/>
+      <w:lvlJc w:val="left"/>
+      <w:pPr>
+        <w:tabs>
+          <w:tab w:val="num" w:pos="2880"/>
+        </w:tabs>
+        <w:ind w:left="2880" w:hanging="360"/>
+      </w:pPr>
+      <w:rPr>
+        <w:rFonts w:ascii="Wingdings" w:hAnsi="Wingdings" w:hint="default"/>
+        <w:sz w:val="20"/>
+      </w:rPr>
+    </w:lvl>
+    <w:lvl w:ilvl="4" w:tentative="1">
+      <w:start w:val="1"/>
+      <w:numFmt w:val="bullet"/>
+      <w:lvlText w:val=""/>
+      <w:lvlJc w:val="left"/>
+      <w:pPr>
+        <w:tabs>
+          <w:tab w:val="num" w:pos="3600"/>
+        </w:tabs>
+        <w:ind w:left="3600" w:hanging="360"/>
+      </w:pPr>
+      <w:rPr>
+        <w:rFonts w:ascii="Wingdings" w:hAnsi="Wingdings" w:hint="default"/>
+        <w:sz w:val="20"/>
+      </w:rPr>
+    </w:lvl>
+    <w:lvl w:ilvl="5" w:tentative="1">
+      <w:start w:val="1"/>
+      <w:numFmt w:val="bullet"/>
+      <w:lvlText w:val=""/>
+      <w:lvlJc w:val="left"/>
+      <w:pPr>
+        <w:tabs>
+          <w:tab w:val="num" w:pos="4320"/>
+        </w:tabs>
+        <w:ind w:left="4320" w:hanging="360"/>
+      </w:pPr>
+      <w:rPr>
+        <w:rFonts w:ascii="Wingdings" w:hAnsi="Wingdings" w:hint="default"/>
+        <w:sz w:val="20"/>
+      </w:rPr>
+    </w:lvl>
+    <w:lvl w:ilvl="6" w:tentative="1">
+      <w:start w:val="1"/>
+      <w:numFmt w:val="bullet"/>
+      <w:lvlText w:val=""/>
+      <w:lvlJc w:val="left"/>
+      <w:pPr>
+        <w:tabs>
+          <w:tab w:val="num" w:pos="5040"/>
+        </w:tabs>
+        <w:ind w:left="5040" w:hanging="360"/>
+      </w:pPr>
+      <w:rPr>
+        <w:rFonts w:ascii="Wingdings" w:hAnsi="Wingdings" w:hint="default"/>
+        <w:sz w:val="20"/>
+      </w:rPr>
+    </w:lvl>
+    <w:lvl w:ilvl="7" w:tentative="1">
+      <w:start w:val="1"/>
+      <w:numFmt w:val="bullet"/>
+      <w:lvlText w:val=""/>
+      <w:lvlJc w:val="left"/>
+      <w:pPr>
+        <w:tabs>
+          <w:tab w:val="num" w:pos="5760"/>
+        </w:tabs>
+        <w:ind w:left="5760" w:hanging="360"/>
+      </w:pPr>
+      <w:rPr>
+        <w:rFonts w:ascii="Wingdings" w:hAnsi="Wingdings" w:hint="default"/>
+        <w:sz w:val="20"/>
+      </w:rPr>
+    </w:lvl>
+    <w:lvl w:ilvl="8" w:tentative="1">
+      <w:start w:val="1"/>
+      <w:numFmt w:val="bullet"/>
+      <w:lvlText w:val=""/>
+      <w:lvlJc w:val="left"/>
+      <w:pPr>
+        <w:tabs>
+          <w:tab w:val="num" w:pos="6480"/>
+        </w:tabs>
+        <w:ind w:left="6480" w:hanging="360"/>
+      </w:pPr>
+      <w:rPr>
+        <w:rFonts w:ascii="Wingdings" w:hAnsi="Wingdings" w:hint="default"/>
+        <w:sz w:val="20"/>
+      </w:rPr>
+    </w:lvl>
+  </w:abstractNum>
+  <w:abstractNum w:abstractNumId="7" w15:restartNumberingAfterBreak="0">
+    <w:nsid w:val="6E976ADA"/>
+    <w:multiLevelType w:val="multilevel"/>
+    <w:tmpl w:val="0A8A9DDA"/>
+    <w:lvl w:ilvl="0">
+      <w:start w:val="1"/>
+      <w:numFmt w:val="bullet"/>
+      <w:lvlText w:val=""/>
+      <w:lvlJc w:val="left"/>
+      <w:pPr>
+        <w:tabs>
+          <w:tab w:val="num" w:pos="720"/>
+        </w:tabs>
+        <w:ind w:left="720" w:hanging="360"/>
+      </w:pPr>
+      <w:rPr>
+        <w:rFonts w:ascii="Symbol" w:hAnsi="Symbol" w:hint="default"/>
+        <w:sz w:val="20"/>
+      </w:rPr>
+    </w:lvl>
+    <w:lvl w:ilvl="1" w:tentative="1">
+      <w:start w:val="1"/>
+      <w:numFmt w:val="bullet"/>
+      <w:lvlText w:val="o"/>
+      <w:lvlJc w:val="left"/>
+      <w:pPr>
+        <w:tabs>
+          <w:tab w:val="num" w:pos="1440"/>
+        </w:tabs>
+        <w:ind w:left="1440" w:hanging="360"/>
+      </w:pPr>
+      <w:rPr>
+        <w:rFonts w:ascii="Courier New" w:hAnsi="Courier New" w:hint="default"/>
+        <w:sz w:val="20"/>
+      </w:rPr>
+    </w:lvl>
+    <w:lvl w:ilvl="2" w:tentative="1">
+      <w:start w:val="1"/>
+      <w:numFmt w:val="bullet"/>
+      <w:lvlText w:val=""/>
+      <w:lvlJc w:val="left"/>
+      <w:pPr>
+        <w:tabs>
+          <w:tab w:val="num" w:pos="2160"/>
+        </w:tabs>
+        <w:ind w:left="2160" w:hanging="360"/>
+      </w:pPr>
+      <w:rPr>
+        <w:rFonts w:ascii="Wingdings" w:hAnsi="Wingdings" w:hint="default"/>
+        <w:sz w:val="20"/>
+      </w:rPr>
+    </w:lvl>
+    <w:lvl w:ilvl="3" w:tentative="1">
+      <w:start w:val="1"/>
+      <w:numFmt w:val="bullet"/>
+      <w:lvlText w:val=""/>
+      <w:lvlJc w:val="left"/>
+      <w:pPr>
+        <w:tabs>
+          <w:tab w:val="num" w:pos="2880"/>
+        </w:tabs>
+        <w:ind w:left="2880" w:hanging="360"/>
+      </w:pPr>
+      <w:rPr>
+        <w:rFonts w:ascii="Wingdings" w:hAnsi="Wingdings" w:hint="default"/>
+        <w:sz w:val="20"/>
+      </w:rPr>
+    </w:lvl>
+    <w:lvl w:ilvl="4" w:tentative="1">
+      <w:start w:val="1"/>
+      <w:numFmt w:val="bullet"/>
+      <w:lvlText w:val=""/>
+      <w:lvlJc w:val="left"/>
+      <w:pPr>
+        <w:tabs>
+          <w:tab w:val="num" w:pos="3600"/>
+        </w:tabs>
+        <w:ind w:left="3600" w:hanging="360"/>
+      </w:pPr>
+      <w:rPr>
+        <w:rFonts w:ascii="Wingdings" w:hAnsi="Wingdings" w:hint="default"/>
+        <w:sz w:val="20"/>
+      </w:rPr>
+    </w:lvl>
+    <w:lvl w:ilvl="5" w:tentative="1">
+      <w:start w:val="1"/>
+      <w:numFmt w:val="bullet"/>
+      <w:lvlText w:val=""/>
+      <w:lvlJc w:val="left"/>
+      <w:pPr>
+        <w:tabs>
+          <w:tab w:val="num" w:pos="4320"/>
+        </w:tabs>
+        <w:ind w:left="4320" w:hanging="360"/>
+      </w:pPr>
+      <w:rPr>
+        <w:rFonts w:ascii="Wingdings" w:hAnsi="Wingdings" w:hint="default"/>
+        <w:sz w:val="20"/>
+      </w:rPr>
+    </w:lvl>
+    <w:lvl w:ilvl="6" w:tentative="1">
+      <w:start w:val="1"/>
+      <w:numFmt w:val="bullet"/>
+      <w:lvlText w:val=""/>
+      <w:lvlJc w:val="left"/>
+      <w:pPr>
+        <w:tabs>
+          <w:tab w:val="num" w:pos="5040"/>
+        </w:tabs>
+        <w:ind w:left="5040" w:hanging="360"/>
+      </w:pPr>
+      <w:rPr>
+        <w:rFonts w:ascii="Wingdings" w:hAnsi="Wingdings" w:hint="default"/>
+        <w:sz w:val="20"/>
+      </w:rPr>
+    </w:lvl>
+    <w:lvl w:ilvl="7" w:tentative="1">
+      <w:start w:val="1"/>
+      <w:numFmt w:val="bullet"/>
+      <w:lvlText w:val=""/>
+      <w:lvlJc w:val="left"/>
+      <w:pPr>
+        <w:tabs>
+          <w:tab w:val="num" w:pos="5760"/>
+        </w:tabs>
+        <w:ind w:left="5760" w:hanging="360"/>
+      </w:pPr>
+      <w:rPr>
+        <w:rFonts w:ascii="Wingdings" w:hAnsi="Wingdings" w:hint="default"/>
+        <w:sz w:val="20"/>
+      </w:rPr>
+    </w:lvl>
+    <w:lvl w:ilvl="8" w:tentative="1">
+      <w:start w:val="1"/>
+      <w:numFmt w:val="bullet"/>
+      <w:lvlText w:val=""/>
+      <w:lvlJc w:val="left"/>
+      <w:pPr>
+        <w:tabs>
+          <w:tab w:val="num" w:pos="6480"/>
+        </w:tabs>
+        <w:ind w:left="6480" w:hanging="360"/>
+      </w:pPr>
+      <w:rPr>
+        <w:rFonts w:ascii="Wingdings" w:hAnsi="Wingdings" w:hint="default"/>
+        <w:sz w:val="20"/>
+      </w:rPr>
+    </w:lvl>
+  </w:abstractNum>
+  <w:abstractNum w:abstractNumId="8" w15:restartNumberingAfterBreak="0">
+    <w:nsid w:val="76B37CB1"/>
+    <w:multiLevelType w:val="multilevel"/>
+    <w:tmpl w:val="E78EEA8C"/>
+    <w:lvl w:ilvl="0">
+      <w:start w:val="1"/>
+      <w:numFmt w:val="bullet"/>
+      <w:lvlText w:val=""/>
+      <w:lvlJc w:val="left"/>
+      <w:pPr>
+        <w:tabs>
+          <w:tab w:val="num" w:pos="720"/>
+        </w:tabs>
+        <w:ind w:left="720" w:hanging="360"/>
+      </w:pPr>
+      <w:rPr>
+        <w:rFonts w:ascii="Symbol" w:hAnsi="Symbol" w:hint="default"/>
+        <w:sz w:val="20"/>
+      </w:rPr>
+    </w:lvl>
+    <w:lvl w:ilvl="1" w:tentative="1">
+      <w:start w:val="1"/>
+      <w:numFmt w:val="bullet"/>
+      <w:lvlText w:val="o"/>
+      <w:lvlJc w:val="left"/>
+      <w:pPr>
+        <w:tabs>
+          <w:tab w:val="num" w:pos="1440"/>
+        </w:tabs>
+        <w:ind w:left="1440" w:hanging="360"/>
+      </w:pPr>
+      <w:rPr>
+        <w:rFonts w:ascii="Courier New" w:hAnsi="Courier New" w:hint="default"/>
+        <w:sz w:val="20"/>
+      </w:rPr>
+    </w:lvl>
+    <w:lvl w:ilvl="2" w:tentative="1">
+      <w:start w:val="1"/>
+      <w:numFmt w:val="bullet"/>
+      <w:lvlText w:val=""/>
+      <w:lvlJc w:val="left"/>
+      <w:pPr>
+        <w:tabs>
+          <w:tab w:val="num" w:pos="2160"/>
+        </w:tabs>
+        <w:ind w:left="2160" w:hanging="360"/>
+      </w:pPr>
+      <w:rPr>
+        <w:rFonts w:ascii="Wingdings" w:hAnsi="Wingdings" w:hint="default"/>
+        <w:sz w:val="20"/>
+      </w:rPr>
+    </w:lvl>
+    <w:lvl w:ilvl="3" w:tentative="1">
+      <w:start w:val="1"/>
+      <w:numFmt w:val="bullet"/>
+      <w:lvlText w:val=""/>
+      <w:lvlJc w:val="left"/>
+      <w:pPr>
+        <w:tabs>
+          <w:tab w:val="num" w:pos="2880"/>
+        </w:tabs>
+        <w:ind w:left="2880" w:hanging="360"/>
+      </w:pPr>
+      <w:rPr>
+        <w:rFonts w:ascii="Wingdings" w:hAnsi="Wingdings" w:hint="default"/>
+        <w:sz w:val="20"/>
+      </w:rPr>
+    </w:lvl>
+    <w:lvl w:ilvl="4" w:tentative="1">
+      <w:start w:val="1"/>
+      <w:numFmt w:val="bullet"/>
+      <w:lvlText w:val=""/>
+      <w:lvlJc w:val="left"/>
+      <w:pPr>
+        <w:tabs>
+          <w:tab w:val="num" w:pos="3600"/>
+        </w:tabs>
+        <w:ind w:left="3600" w:hanging="360"/>
+      </w:pPr>
+      <w:rPr>
+        <w:rFonts w:ascii="Wingdings" w:hAnsi="Wingdings" w:hint="default"/>
+        <w:sz w:val="20"/>
+      </w:rPr>
+    </w:lvl>
+    <w:lvl w:ilvl="5" w:tentative="1">
+      <w:start w:val="1"/>
+      <w:numFmt w:val="bullet"/>
+      <w:lvlText w:val=""/>
+      <w:lvlJc w:val="left"/>
+      <w:pPr>
+        <w:tabs>
+          <w:tab w:val="num" w:pos="4320"/>
+        </w:tabs>
+        <w:ind w:left="4320" w:hanging="360"/>
+      </w:pPr>
+      <w:rPr>
+        <w:rFonts w:ascii="Wingdings" w:hAnsi="Wingdings" w:hint="default"/>
+        <w:sz w:val="20"/>
+      </w:rPr>
+    </w:lvl>
+    <w:lvl w:ilvl="6" w:tentative="1">
+      <w:start w:val="1"/>
+      <w:numFmt w:val="bullet"/>
+      <w:lvlText w:val=""/>
+      <w:lvlJc w:val="left"/>
+      <w:pPr>
+        <w:tabs>
+          <w:tab w:val="num" w:pos="5040"/>
+        </w:tabs>
+        <w:ind w:left="5040" w:hanging="360"/>
+      </w:pPr>
+      <w:rPr>
+        <w:rFonts w:ascii="Wingdings" w:hAnsi="Wingdings" w:hint="default"/>
+        <w:sz w:val="20"/>
+      </w:rPr>
+    </w:lvl>
+    <w:lvl w:ilvl="7" w:tentative="1">
+      <w:start w:val="1"/>
+      <w:numFmt w:val="bullet"/>
+      <w:lvlText w:val=""/>
+      <w:lvlJc w:val="left"/>
+      <w:pPr>
+        <w:tabs>
+          <w:tab w:val="num" w:pos="5760"/>
+        </w:tabs>
+        <w:ind w:left="5760" w:hanging="360"/>
+      </w:pPr>
+      <w:rPr>
+        <w:rFonts w:ascii="Wingdings" w:hAnsi="Wingdings" w:hint="default"/>
+        <w:sz w:val="20"/>
+      </w:rPr>
+    </w:lvl>
+    <w:lvl w:ilvl="8" w:tentative="1">
+      <w:start w:val="1"/>
+      <w:numFmt w:val="bullet"/>
+      <w:lvlText w:val=""/>
+      <w:lvlJc w:val="left"/>
+      <w:pPr>
+        <w:tabs>
+          <w:tab w:val="num" w:pos="6480"/>
+        </w:tabs>
+        <w:ind w:left="6480" w:hanging="360"/>
+      </w:pPr>
+      <w:rPr>
+        <w:rFonts w:ascii="Wingdings" w:hAnsi="Wingdings" w:hint="default"/>
+        <w:sz w:val="20"/>
+      </w:rPr>
+    </w:lvl>
+  </w:abstractNum>
+  <w:num w:numId="1" w16cid:durableId="1263416736">
+    <w:abstractNumId w:val="8"/>
+  </w:num>
+  <w:num w:numId="2" w16cid:durableId="1103308499">
+    <w:abstractNumId w:val="5"/>
+  </w:num>
+  <w:num w:numId="3" w16cid:durableId="201209360">
+    <w:abstractNumId w:val="3"/>
+  </w:num>
+  <w:num w:numId="4" w16cid:durableId="1094087318">
+    <w:abstractNumId w:val="6"/>
+  </w:num>
+  <w:num w:numId="5" w16cid:durableId="228228149">
+    <w:abstractNumId w:val="2"/>
+  </w:num>
+  <w:num w:numId="6" w16cid:durableId="2063403083">
+    <w:abstractNumId w:val="1"/>
+  </w:num>
+  <w:num w:numId="7" w16cid:durableId="2085106240">
+    <w:abstractNumId w:val="0"/>
+  </w:num>
+  <w:num w:numId="8" w16cid:durableId="1868367325">
+    <w:abstractNumId w:val="4"/>
+  </w:num>
+  <w:num w:numId="9" w16cid:durableId="514853287">
+    <w:abstractNumId w:val="7"/>
+  </w:num>
+</w:numbering>
 </file>
 
 <file path=word/styles.xml><?xml version="1.0" encoding="utf-8"?>
@@ -1538,7 +5069,6 @@
   <w:style w:type="character" w:default="1" w:styleId="Standaardalinea-lettertype">
     <w:name w:val="Default Paragraph Font"/>
     <w:uiPriority w:val="1"/>
-    <w:semiHidden/>
     <w:unhideWhenUsed/>
   </w:style>
   <w:style w:type="table" w:default="1" w:styleId="Standaardtabel">
@@ -1822,6 +5352,19 @@
       <w:u w:val="single"/>
     </w:rPr>
   </w:style>
+  <w:style w:type="paragraph" w:styleId="Inhopg2">
+    <w:name w:val="toc 2"/>
+    <w:basedOn w:val="Standaard"/>
+    <w:next w:val="Standaard"/>
+    <w:autoRedefine/>
+    <w:uiPriority w:val="39"/>
+    <w:unhideWhenUsed/>
+    <w:rsid w:val="001D1F15"/>
+    <w:pPr>
+      <w:spacing w:after="100"/>
+      <w:ind w:left="240"/>
+    </w:pPr>
+  </w:style>
 </w:styles>
 </file>
 
@@ -2001,6 +5544,34 @@
 
 <file path=word/glossary/fontTable.xml><?xml version="1.0" encoding="utf-8"?>
 <w:fonts xmlns:mc="http://schemas.openxmlformats.org/markup-compatibility/2006" xmlns:r="http://schemas.openxmlformats.org/officeDocument/2006/relationships" xmlns:w="http://schemas.openxmlformats.org/wordprocessingml/2006/main" xmlns:w14="http://schemas.microsoft.com/office/word/2010/wordml" xmlns:w15="http://schemas.microsoft.com/office/word/2012/wordml" xmlns:w16cex="http://schemas.microsoft.com/office/word/2018/wordml/cex" xmlns:w16cid="http://schemas.microsoft.com/office/word/2016/wordml/cid" xmlns:w16="http://schemas.microsoft.com/office/word/2018/wordml" xmlns:w16du="http://schemas.microsoft.com/office/word/2023/wordml/word16du" xmlns:w16sdtdh="http://schemas.microsoft.com/office/word/2020/wordml/sdtdatahash" xmlns:w16sdtfl="http://schemas.microsoft.com/office/word/2024/wordml/sdtformatlock" xmlns:w16se="http://schemas.microsoft.com/office/word/2015/wordml/symex" mc:Ignorable="w14 w15 w16se w16cid w16 w16cex w16sdtdh w16sdtfl w16du">
+  <w:font w:name="Symbol">
+    <w:panose1 w:val="05050102010706020507"/>
+    <w:charset w:val="02"/>
+    <w:family w:val="roman"/>
+    <w:pitch w:val="variable"/>
+    <w:sig w:usb0="00000000" w:usb1="10000000" w:usb2="00000000" w:usb3="00000000" w:csb0="80000000" w:csb1="00000000"/>
+  </w:font>
+  <w:font w:name="Times New Roman">
+    <w:panose1 w:val="02020603050405020304"/>
+    <w:charset w:val="00"/>
+    <w:family w:val="roman"/>
+    <w:pitch w:val="variable"/>
+    <w:sig w:usb0="E0002EFF" w:usb1="C000785B" w:usb2="00000009" w:usb3="00000000" w:csb0="000001FF" w:csb1="00000000"/>
+  </w:font>
+  <w:font w:name="Courier New">
+    <w:panose1 w:val="02070309020205020404"/>
+    <w:charset w:val="00"/>
+    <w:family w:val="modern"/>
+    <w:pitch w:val="fixed"/>
+    <w:sig w:usb0="E0002EFF" w:usb1="C0007843" w:usb2="00000009" w:usb3="00000000" w:csb0="000001FF" w:csb1="00000000"/>
+  </w:font>
+  <w:font w:name="Wingdings">
+    <w:panose1 w:val="05000000000000000000"/>
+    <w:charset w:val="02"/>
+    <w:family w:val="auto"/>
+    <w:pitch w:val="variable"/>
+    <w:sig w:usb0="00000000" w:usb1="10000000" w:usb2="00000000" w:usb3="00000000" w:csb0="80000000" w:csb1="00000000"/>
+  </w:font>
   <w:font w:name="Calibri">
     <w:panose1 w:val="020F0502020204030204"/>
     <w:charset w:val="00"/>
@@ -2012,13 +5583,6 @@
     <w:panose1 w:val="020B0604020202020204"/>
     <w:charset w:val="00"/>
     <w:family w:val="swiss"/>
-    <w:pitch w:val="variable"/>
-    <w:sig w:usb0="E0002EFF" w:usb1="C000785B" w:usb2="00000009" w:usb3="00000000" w:csb0="000001FF" w:csb1="00000000"/>
-  </w:font>
-  <w:font w:name="Times New Roman">
-    <w:panose1 w:val="02020603050405020304"/>
-    <w:charset w:val="00"/>
-    <w:family w:val="roman"/>
     <w:pitch w:val="variable"/>
     <w:sig w:usb0="E0002EFF" w:usb1="C000785B" w:usb2="00000009" w:usb3="00000000" w:csb0="000001FF" w:csb1="00000000"/>
   </w:font>
@@ -2057,6 +5621,18 @@
     <w:pitch w:val="variable"/>
     <w:sig w:usb0="800002E7" w:usb1="2AC7FCFF" w:usb2="00000012" w:usb3="00000000" w:csb0="0002009F" w:csb1="00000000"/>
   </w:font>
+  <w:font w:name="Aptos">
+    <w:charset w:val="00"/>
+    <w:family w:val="swiss"/>
+    <w:pitch w:val="variable"/>
+    <w:sig w:usb0="20000287" w:usb1="00000003" w:usb2="00000000" w:usb3="00000000" w:csb0="0000019F" w:csb1="00000000"/>
+  </w:font>
+  <w:font w:name="Aptos Display">
+    <w:charset w:val="00"/>
+    <w:family w:val="swiss"/>
+    <w:pitch w:val="variable"/>
+    <w:sig w:usb0="20000287" w:usb1="00000003" w:usb2="00000000" w:usb3="00000000" w:csb0="0000019F" w:csb1="00000000"/>
+  </w:font>
 </w:fonts>
 </file>
 
@@ -2085,7 +5661,9 @@
     <w:rsid w:val="005B160E"/>
     <w:rsid w:val="006D4892"/>
     <w:rsid w:val="006E39EC"/>
+    <w:rsid w:val="00714D2B"/>
     <w:rsid w:val="007B6908"/>
+    <w:rsid w:val="008069C0"/>
     <w:rsid w:val="008B350A"/>
     <w:rsid w:val="00B5485A"/>
     <w:rsid w:val="00B631DB"/>
@@ -2566,10 +6144,6 @@
     <w:name w:val="D506A22CE1344E31A02103C79C17A3C5"/>
     <w:rsid w:val="00E64492"/>
   </w:style>
-  <w:style w:type="paragraph" w:customStyle="1" w:styleId="00B30D749548456CB46BFA894EE72A97">
-    <w:name w:val="00B30D749548456CB46BFA894EE72A97"/>
-    <w:rsid w:val="00E64492"/>
-  </w:style>
   <w:style w:type="paragraph" w:customStyle="1" w:styleId="14A2ABBDFB3F4E8EBAAA416777795792">
     <w:name w:val="14A2ABBDFB3F4E8EBAAA416777795792"/>
     <w:pPr>
@@ -2578,7 +6152,6 @@
     <w:rPr>
       <w:sz w:val="24"/>
       <w:szCs w:val="24"/>
-      <w:lang/>
     </w:rPr>
   </w:style>
 </w:styles>
@@ -2895,19 +6468,6 @@
 </file>
 
 <file path=customXml/item2.xml><?xml version="1.0" encoding="utf-8"?>
-<?mso-contentType ?>
-<FormTemplates xmlns="http://schemas.microsoft.com/sharepoint/v3/contenttype/forms">
-  <Display>DocumentLibraryForm</Display>
-  <Edit>DocumentLibraryForm</Edit>
-  <New>DocumentLibraryForm</New>
-</FormTemplates>
-</file>
-
-<file path=customXml/item3.xml><?xml version="1.0" encoding="utf-8"?>
-<b:Sources xmlns:b="http://schemas.openxmlformats.org/officeDocument/2006/bibliography" xmlns="http://schemas.openxmlformats.org/officeDocument/2006/bibliography" SelectedStyle="\APASixthEditionOfficeOnline.xsl" StyleName="APA" Version="6"/>
-</file>
-
-<file path=customXml/item4.xml><?xml version="1.0" encoding="utf-8"?>
 <ct:contentTypeSchema xmlns:ct="http://schemas.microsoft.com/office/2006/metadata/contentType" xmlns:ma="http://schemas.microsoft.com/office/2006/metadata/properties/metaAttributes" ct:_="" ma:_="" ma:contentTypeName="Document" ma:contentTypeID="0x0101002C0078F63934E143B21FE079B3878406" ma:contentTypeVersion="11" ma:contentTypeDescription="Een nieuw document maken." ma:contentTypeScope="" ma:versionID="4e4c13eba49a8fecfde5543eca60b0ba">
   <xsd:schema xmlns:xsd="http://www.w3.org/2001/XMLSchema" xmlns:xs="http://www.w3.org/2001/XMLSchema" xmlns:p="http://schemas.microsoft.com/office/2006/metadata/properties" xmlns:ns3="21413aa0-5d31-4ac8-b96a-eb9a18cfac0d" targetNamespace="http://schemas.microsoft.com/office/2006/metadata/properties" ma:root="true" ma:fieldsID="b35348315be84e5d41be0ebc71662b09" ns3:_="">
     <xsd:import namespace="21413aa0-5d31-4ac8-b96a-eb9a18cfac0d"/>
@@ -3095,6 +6655,19 @@
 </ct:contentTypeSchema>
 </file>
 
+<file path=customXml/item3.xml><?xml version="1.0" encoding="utf-8"?>
+<b:Sources xmlns:b="http://schemas.openxmlformats.org/officeDocument/2006/bibliography" xmlns="http://schemas.openxmlformats.org/officeDocument/2006/bibliography" SelectedStyle="\APASixthEditionOfficeOnline.xsl" StyleName="APA" Version="6"/>
+</file>
+
+<file path=customXml/item4.xml><?xml version="1.0" encoding="utf-8"?>
+<?mso-contentType ?>
+<FormTemplates xmlns="http://schemas.microsoft.com/sharepoint/v3/contenttype/forms">
+  <Display>DocumentLibraryForm</Display>
+  <Edit>DocumentLibraryForm</Edit>
+  <New>DocumentLibraryForm</New>
+</FormTemplates>
+</file>
+
 <file path=customXml/itemProps1.xml><?xml version="1.0" encoding="utf-8"?>
 <ds:datastoreItem xmlns:ds="http://schemas.openxmlformats.org/officeDocument/2006/customXml" ds:itemID="{17C2B775-EA4E-4441-ABF7-098F71DCBCF5}">
   <ds:schemaRefs>
@@ -3106,22 +6679,6 @@
 </file>
 
 <file path=customXml/itemProps2.xml><?xml version="1.0" encoding="utf-8"?>
-<ds:datastoreItem xmlns:ds="http://schemas.openxmlformats.org/officeDocument/2006/customXml" ds:itemID="{AA590523-BE1F-4D4A-874A-179EF7E49155}">
-  <ds:schemaRefs>
-    <ds:schemaRef ds:uri="http://schemas.microsoft.com/sharepoint/v3/contenttype/forms"/>
-  </ds:schemaRefs>
-</ds:datastoreItem>
-</file>
-
-<file path=customXml/itemProps3.xml><?xml version="1.0" encoding="utf-8"?>
-<ds:datastoreItem xmlns:ds="http://schemas.openxmlformats.org/officeDocument/2006/customXml" ds:itemID="{A01A2E88-B95C-4E54-8A5A-E22DB6C02629}">
-  <ds:schemaRefs>
-    <ds:schemaRef ds:uri="http://schemas.openxmlformats.org/officeDocument/2006/bibliography"/>
-  </ds:schemaRefs>
-</ds:datastoreItem>
-</file>
-
-<file path=customXml/itemProps4.xml><?xml version="1.0" encoding="utf-8"?>
 <ds:datastoreItem xmlns:ds="http://schemas.openxmlformats.org/officeDocument/2006/customXml" ds:itemID="{C551EFAC-91D4-41D2-BD0C-FC46644CDAB5}">
   <ds:schemaRefs>
     <ds:schemaRef ds:uri="http://schemas.microsoft.com/office/2006/metadata/contentType"/>
@@ -3137,4 +6694,20 @@
     <ds:schemaRef ds:uri="http://schemas.microsoft.com/internal/obd"/>
   </ds:schemaRefs>
 </ds:datastoreItem>
+</file>
+
+<file path=customXml/itemProps3.xml><?xml version="1.0" encoding="utf-8"?>
+<ds:datastoreItem xmlns:ds="http://schemas.openxmlformats.org/officeDocument/2006/customXml" ds:itemID="{A01A2E88-B95C-4E54-8A5A-E22DB6C02629}">
+  <ds:schemaRefs>
+    <ds:schemaRef ds:uri="http://schemas.openxmlformats.org/officeDocument/2006/bibliography"/>
+  </ds:schemaRefs>
+</ds:datastoreItem>
+</file>
+
+<file path=customXml/itemProps4.xml><?xml version="1.0" encoding="utf-8"?>
+<ds:datastoreItem xmlns:ds="http://schemas.openxmlformats.org/officeDocument/2006/customXml" ds:itemID="{AA590523-BE1F-4D4A-874A-179EF7E49155}">
+  <ds:schemaRefs>
+    <ds:schemaRef ds:uri="http://schemas.microsoft.com/sharepoint/v3/contenttype/forms"/>
+  </ds:schemaRefs>
+</ds:datastoreItem>
 </file>
</xml_diff>